<commit_message>
fix(cv): Astra-Review 7b88165 - Social-Satz eng gefasst, genaues Ablaufdatum
- FlowKI Club: Markenpruefung nur fuer die pendpost-Uebergabe belegt (publish-due.ts
  prueft nicht) -> 'Uebergabe an pendpost mit Qualitaetspruefung und Markenregeln'
- Zertifikat: gueltig bis 03.12.2026 statt 'Dezember 2026'
</commit_message>
<xml_diff>
--- a/ats-cv/Jason_Roschmann_CV_Marketing_ATS.docx
+++ b/ats-cv/Jason_Roschmann_CV_Marketing_ATS.docx
@@ -244,7 +244,7 @@
         </w:numPr>
       </w:pPr>
       <w:r>
-        <w:t xml:space="preserve">Social-Distribution automatisiert: aus Artikeln entstehen plattformgerechte Post-Pakete; ein Marken-Prüfschritt läuft vor der Veröffentlichung; UTM-Konvention und Link-Bio-Seite.</w:t>
+        <w:t xml:space="preserve">Social-Distribution automatisiert: plattformgerechte Social-Post-Pakete aus Artikeln erzeugt; Übergabe an pendpost mit Qualitätsprüfung und Markenregeln aufgebaut; UTM-Konvention und Link-in-Bio-Seite umgesetzt.</w:t>
       </w:r>
     </w:p>
     <w:p>
@@ -439,7 +439,7 @@
         </w:numPr>
       </w:pPr>
       <w:r>
-        <w:t xml:space="preserve">Google Ads Search Certification (Skillshop), Dezember 2025, gültig bis Dezember 2026 – verifizierbar:</w:t>
+        <w:t xml:space="preserve">Google Ads Search Certification (Skillshop), Dezember 2025, gültig bis 03.12.2026 – verifizierbar:</w:t>
       </w:r>
       <w:r>
         <w:t xml:space="preserve"> </w:t>

</xml_diff>

<commit_message>
feat(cv): Marketing-Fassung v2 - Technical SEO, dreiteilige duftkumpels-Fallstudie, Astra-Faktenblatt
- Titel/Profil nach Astra-Positionierung, 4 Kompetenzgruppen, Belege 700/128/Ads
- Fallstudie: Gefunden werden / Mehrsprachigkeit / Kaufen und nachfassen
- Seite 2: FlowKI Club, Flowki Studio, Webdesign & Kreativ-KI, SEO-Dashboard-Prototyp
- CSS: Listen in Fallstudien-Spalten, Marker in Textgroesse (Poppler-Reihenfolge), .nw gegen Bindestrich-Verschmelzung
- Build: docx-Schritt mit Wiederholversuch bei fluechtiger Dateisperre
</commit_message>
<xml_diff>
--- a/ats-cv/Jason_Roschmann_CV_Marketing_ATS.docx
+++ b/ats-cv/Jason_Roschmann_CV_Marketing_ATS.docx
@@ -2,7 +2,7 @@
 <file path=word/document.xml><?xml version="1.0" encoding="utf-8"?>
 <w:document xmlns:w="http://schemas.openxmlformats.org/wordprocessingml/2006/main" xmlns:m="http://schemas.openxmlformats.org/officeDocument/2006/math" xmlns:r="http://schemas.openxmlformats.org/officeDocument/2006/relationships" xmlns:o="urn:schemas-microsoft-com:office:office" xmlns:v="urn:schemas-microsoft-com:vml" xmlns:w10="urn:schemas-microsoft-com:office:word" xmlns:a="http://schemas.openxmlformats.org/drawingml/2006/main" xmlns:pic="http://schemas.openxmlformats.org/drawingml/2006/picture" xmlns:wp="http://schemas.openxmlformats.org/drawingml/2006/wordprocessingDrawing">
   <w:body>
-    <w:bookmarkStart w:id="22" w:name="jason-roschmann"/>
+    <w:bookmarkStart w:id="23" w:name="jason-roschmann"/>
     <w:p>
       <w:pPr>
         <w:pStyle w:val="Heading1"/>
@@ -16,7 +16,7 @@
         <w:pStyle w:val="FirstParagraph"/>
       </w:pPr>
       <w:r>
-        <w:t xml:space="preserve">Junior E-Commerce &amp; Online-Marketing · Technisches SEO · Shopify · Marketing-Automation</w:t>
+        <w:t xml:space="preserve">Junior E-Commerce &amp; Technical SEO · Shopify · Marketing-Automation</w:t>
       </w:r>
     </w:p>
     <w:p>
@@ -24,7 +24,7 @@
         <w:pStyle w:val="BodyText"/>
       </w:pPr>
       <w:r>
-        <w:t xml:space="preserve">Ich verbinde Shopify, SEO-Daten und Marketing-Automationen – und prüfe die Messung dahinter.</w:t>
+        <w:t xml:space="preserve">Ich verbinde Suchdaten, Shop-Entwicklung und Automatisierung – und prüfe die Änderungen am tatsächlichen System.</w:t>
       </w:r>
     </w:p>
     <w:p>
@@ -52,7 +52,7 @@
         <w:pStyle w:val="BodyText"/>
       </w:pPr>
       <w:r>
-        <w:t xml:space="preserve">Schwerpunkte: Google Search Console, GA4, Plausible, strukturierte Daten, Shopify, Google Merchant Center, Klaviyo, Python, n8n</w:t>
+        <w:t xml:space="preserve">Schwerpunkte: Technisches SEO, strukturierte Daten (JSON-LD), GEO/AEO, Google Search Console, GA4, Shopify (Liquid, Metafields), Klaviyo, Google Merchant Center, Python, n8n</w:t>
       </w:r>
     </w:p>
     <w:bookmarkStart w:id="9" w:name="profil"/>
@@ -69,26 +69,26 @@
         <w:pStyle w:val="FirstParagraph"/>
       </w:pPr>
       <w:r>
-        <w:t xml:space="preserve">Ich arbeite an der Schnittstelle von Shop, SEO-Daten und Marketing-Automation: Search-Console-Auswertungen, strukturierte Daten, Produktfeeds und E-Mail-Flows in Shopify — bis in Code und Templates. Vier Jahre B2B-Direktvertrieb haben mir gezeigt, woran Kaufentscheidungen hängen. Wiederkehrende Auswertungen automatisiere ich mit Python und KI-Agenten, und bevor ich aus Zahlen Schlüsse ziehe, prüfe ich die Messung. Ich suche eine Junior-Rolle in E-Commerce, technischem SEO oder Marketing-Automation.</w:t>
+        <w:t xml:space="preserve">Ich entwickle und verbessere Shopify-Shops mit Schwerpunkt auf technischem SEO, mehrsprachigen Inhalten und Marketing-Automation. Bei duftkumpels habe ich unter anderem Suchdaten ausgewertet, Themenverknüpfungen aufgebaut, Übersetzungsabläufe implementiert und einen fehlerhaften Klaviyo-Checkout-Link korrigiert. KI nutze ich für Recherche, Umsetzung und Content-Workflows; Befunde prüfe ich anhand von Quelldaten, Tests und Gegenmessungen. Vier Jahre B2B-Direktvertrieb haben mir gezeigt, woran Kaufentscheidungen hängen.</w:t>
       </w:r>
     </w:p>
     <w:bookmarkEnd w:id="9"/>
-    <w:bookmarkStart w:id="11" w:name="e-commerce-seo-in-der-praxis"/>
+    <w:bookmarkStart w:id="11" w:name="fallstudie-e-commerce-seo"/>
     <w:p>
       <w:pPr>
         <w:pStyle w:val="Heading2"/>
       </w:pPr>
       <w:r>
-        <w:t xml:space="preserve">E-Commerce &amp; SEO in der Praxis</w:t>
-      </w:r>
-    </w:p>
-    <w:bookmarkStart w:id="10" w:name="Xb5c3b9d1369fa19f9454e2582e2f064cdce2599"/>
+        <w:t xml:space="preserve">Fallstudie E-Commerce &amp; SEO</w:t>
+      </w:r>
+    </w:p>
+    <w:bookmarkStart w:id="10" w:name="Xf794ea0567facb09dd516c29c08d64e228b88b4"/>
     <w:p>
       <w:pPr>
         <w:pStyle w:val="Heading3"/>
       </w:pPr>
       <w:r>
-        <w:t xml:space="preserve">duftkumpels.shop (Kundenprojekt, seit Juni 2026)</w:t>
+        <w:t xml:space="preserve">duftkumpels.shop — Shopify, DE/EN/FR (Kundenprojekt, Projektarbeit seit Juni 2026)</w:t>
       </w:r>
     </w:p>
     <w:p>
@@ -96,7 +96,15 @@
         <w:pStyle w:val="FirstParagraph"/>
       </w:pPr>
       <w:r>
-        <w:t xml:space="preserve">Zweck: Shopify-Shop einer Hamburger Nischen-Parfümerie, dreisprachig (DE/EN/FR). Mein Teil: Theme, SEO, Produktdaten, E-Mail-Flows und Messung.</w:t>
+        <w:t xml:space="preserve">Hamburger Nischen-Parfümerie. Mein Teil: Theme, SEO, Mehrsprachigkeit, Produktdaten, E-Mail-Flows und Messung.</w:t>
+      </w:r>
+    </w:p>
+    <w:p>
+      <w:pPr>
+        <w:pStyle w:val="BodyText"/>
+      </w:pPr>
+      <w:r>
+        <w:t xml:space="preserve">Gefunden werden:</w:t>
       </w:r>
     </w:p>
     <w:p>
@@ -108,7 +116,7 @@
         </w:numPr>
       </w:pPr>
       <w:r>
-        <w:t xml:space="preserve">Messen: Search-Console-Auswertung für Suchfragen in DE/EN/FR automatisiert; Indexierungsstatus von 700 URLs geprüft und eine priorisierte Bearbeitungsliste erstellt.</w:t>
+        <w:t xml:space="preserve">Search-Console-Auswertung der Suchfragen in DE/EN/FR automatisiert; Titel und Metadaten danach angepasst.</w:t>
       </w:r>
     </w:p>
     <w:p>
@@ -120,7 +128,7 @@
         </w:numPr>
       </w:pPr>
       <w:r>
-        <w:t xml:space="preserve">Ändern: Titel und Metadaten anhand der Suchdaten angepasst; Artikel-, Blog- und Organization-Markup ergänzt; Bildladeprioritäten auf Kollektions- und Produktseiten korrigiert.</w:t>
+        <w:t xml:space="preserve">Indexierungsstatus von 700 URLs geprüft, Bearbeitung priorisiert.</w:t>
       </w:r>
     </w:p>
     <w:p>
@@ -132,7 +140,7 @@
         </w:numPr>
       </w:pPr>
       <w:r>
-        <w:t xml:space="preserve">Gegenprüfen: Vorwerte gesichert, live gegengelesen, per IndexNow gemeldet; einen CSS-Preload-Patch nach ungünstigen Messläufen zurückgerollt.</w:t>
+        <w:t xml:space="preserve">Themenindex für 128 Artikel aufgebaut; Artikel und 60 Produkte über Metafelder verknüpft.</w:t>
       </w:r>
     </w:p>
     <w:p>
@@ -144,7 +152,7 @@
         </w:numPr>
       </w:pPr>
       <w:r>
-        <w:t xml:space="preserve">Wahrheitsprüfung: Ein automatischer Abgleich von SEO-Verfügbarkeitsaussagen mit kaufbaren Varianten fand zwei falsche Aussagen — beide korrigiert.</w:t>
+        <w:t xml:space="preserve">Canonical-Ziele für 19 thematisch überlappende Blogartikel gesetzt.</w:t>
       </w:r>
     </w:p>
     <w:p>
@@ -156,7 +164,7 @@
         </w:numPr>
       </w:pPr>
       <w:r>
-        <w:t xml:space="preserve">E-Mail-Automation: Fehlerhaften Rückkehrlink einer Klaviyo-Abbruchmail durch einen wiederherstellbaren Checkout-Link ersetzt; fehlende Trackingparameter ergänzt.</w:t>
+        <w:t xml:space="preserve">Artikel-, Blog-, Listen-, Person- und Organisationsdaten in JSON-LD ergänzt und automatisiert geprüft.</w:t>
       </w:r>
     </w:p>
     <w:p>
@@ -168,42 +176,150 @@
         </w:numPr>
       </w:pPr>
       <w:r>
-        <w:t xml:space="preserve">Feeds &amp; Kanäle: Merchant-Center-Probleme auf Produktebene analysiert, Produktkategorien und Kanalzuordnung korrigiert; Microsoft- und Pinterest-Kanal angebunden.</w:t>
-      </w:r>
-    </w:p>
-    <w:p>
-      <w:pPr>
-        <w:pStyle w:val="Compact"/>
-        <w:numPr>
-          <w:ilvl w:val="0"/>
-          <w:numId w:val="1001"/>
-        </w:numPr>
-      </w:pPr>
-      <w:r>
-        <w:t xml:space="preserve">Messung: GA4-Kaufzahlen mit Shopify-Bestellungen abgeglichen; wöchentliche Lighthouse-Prüfung gegen den Live-Shop per GitHub Actions.</w:t>
-      </w:r>
-    </w:p>
-    <w:p>
-      <w:pPr>
-        <w:pStyle w:val="Compact"/>
-        <w:numPr>
-          <w:ilvl w:val="0"/>
-          <w:numId w:val="1001"/>
-        </w:numPr>
-      </w:pPr>
-      <w:r>
-        <w:t xml:space="preserve">Shop &amp; Theme: Gekauftes Shopify-Theme in Liquid, CSS und JavaScript umgebaut; eigene Design-Schicht im Live-Theme, Produktdaten über Metafields.</w:t>
+        <w:t xml:space="preserve">GEO/AEO: Seiten anhand von zehn Käuferfragen auf direkt auffindbare Antworten geprüft und Inhaltslücken dokumentiert; bestehende llms.txt-Ausgabe um aktuelle Kataloginformationen erweitert.</w:t>
+      </w:r>
+    </w:p>
+    <w:p>
+      <w:pPr>
+        <w:pStyle w:val="FirstParagraph"/>
+      </w:pPr>
+      <w:r>
+        <w:t xml:space="preserve">In mehreren Sprachen:</w:t>
+      </w:r>
+    </w:p>
+    <w:p>
+      <w:pPr>
+        <w:pStyle w:val="Compact"/>
+        <w:numPr>
+          <w:ilvl w:val="0"/>
+          <w:numId w:val="1002"/>
+        </w:numPr>
+      </w:pPr>
+      <w:r>
+        <w:t xml:space="preserve">Übersetzungs-Pipeline aufgebaut: HTML-Extraktion, Strukturprüfung, Shopify-Import über CSV bzw. GraphQL.</w:t>
+      </w:r>
+    </w:p>
+    <w:p>
+      <w:pPr>
+        <w:pStyle w:val="Compact"/>
+        <w:numPr>
+          <w:ilvl w:val="0"/>
+          <w:numId w:val="1002"/>
+        </w:numPr>
+      </w:pPr>
+      <w:r>
+        <w:t xml:space="preserve">EN/FR-Artikel anhand vorhandener Suchimpressionen priorisiert und eingespielt.</w:t>
+      </w:r>
+    </w:p>
+    <w:p>
+      <w:pPr>
+        <w:pStyle w:val="Compact"/>
+        <w:numPr>
+          <w:ilvl w:val="0"/>
+          <w:numId w:val="1002"/>
+        </w:numPr>
+      </w:pPr>
+      <w:r>
+        <w:t xml:space="preserve">Produktnamen sprachübergreifend vereinheitlicht; Produkttypen, Kollektionstitel und Hero-Texte lokalisiert.</w:t>
+      </w:r>
+    </w:p>
+    <w:p>
+      <w:pPr>
+        <w:pStyle w:val="Compact"/>
+        <w:numPr>
+          <w:ilvl w:val="0"/>
+          <w:numId w:val="1002"/>
+        </w:numPr>
+      </w:pPr>
+      <w:r>
+        <w:t xml:space="preserve">Fehlerhafte EN/FR-Sprachweiterleitungen reproduziert und auf das Shopify-Routing eingegrenzt.</w:t>
+      </w:r>
+    </w:p>
+    <w:p>
+      <w:pPr>
+        <w:pStyle w:val="FirstParagraph"/>
+      </w:pPr>
+      <w:r>
+        <w:t xml:space="preserve">Kaufen und nachfassen:</w:t>
+      </w:r>
+    </w:p>
+    <w:p>
+      <w:pPr>
+        <w:pStyle w:val="Compact"/>
+        <w:numPr>
+          <w:ilvl w:val="0"/>
+          <w:numId w:val="1003"/>
+        </w:numPr>
+      </w:pPr>
+      <w:r>
+        <w:t xml:space="preserve">Klaviyo-Abbruchmail auf wiederherstellbaren Checkout-Link umgestellt; fehlendes Onsite-Embed diagnostiziert, aktiviert.</w:t>
+      </w:r>
+    </w:p>
+    <w:p>
+      <w:pPr>
+        <w:pStyle w:val="Compact"/>
+        <w:numPr>
+          <w:ilvl w:val="0"/>
+          <w:numId w:val="1003"/>
+        </w:numPr>
+      </w:pPr>
+      <w:r>
+        <w:t xml:space="preserve">Merchant-Center-Probleme analysiert, Kategorien und Zuordnung korrigiert; Microsoft- und Pinterest-Kanal angebunden.</w:t>
+      </w:r>
+    </w:p>
+    <w:p>
+      <w:pPr>
+        <w:pStyle w:val="Compact"/>
+        <w:numPr>
+          <w:ilvl w:val="0"/>
+          <w:numId w:val="1003"/>
+        </w:numPr>
+      </w:pPr>
+      <w:r>
+        <w:t xml:space="preserve">Nicht lieferbare Produkte auf Wissensseiten gekennzeichnet, verfügbare Alternativen eingeblendet.</w:t>
+      </w:r>
+    </w:p>
+    <w:p>
+      <w:pPr>
+        <w:pStyle w:val="Compact"/>
+        <w:numPr>
+          <w:ilvl w:val="0"/>
+          <w:numId w:val="1003"/>
+        </w:numPr>
+      </w:pPr>
+      <w:r>
+        <w:t xml:space="preserve">GA4-Kaufzahlen mit Shopify-Bestellungen abgeglichen.</w:t>
+      </w:r>
+    </w:p>
+    <w:p>
+      <w:pPr>
+        <w:pStyle w:val="Compact"/>
+        <w:numPr>
+          <w:ilvl w:val="0"/>
+          <w:numId w:val="1003"/>
+        </w:numPr>
+      </w:pPr>
+      <w:r>
+        <w:t xml:space="preserve">Gekauftes Theme in Liquid, CSS und JavaScript umgebaut; Bildladeprioritäten korrigiert; wöchentliche Lighthouse-Prüfung per GitHub Actions.</w:t>
+      </w:r>
+    </w:p>
+    <w:p>
+      <w:pPr>
+        <w:pStyle w:val="FirstParagraph"/>
+      </w:pPr>
+      <w:r>
+        <w:t xml:space="preserve">Gegenprüfung statt Annahme: SEO-Verfügbarkeitsaussagen automatisch mit kaufbaren Varianten abgeglichen — zwei falsche korrigiert; einen CSS-Preload-Patch nach ungünstigen Messläufen zurückgerollt; einen KI-Auditbefund zu angeblich fehlenden Grundpreisen anhand von Produktdaten und gerenderter Ausgabe widerlegt.</w:t>
       </w:r>
     </w:p>
     <w:bookmarkEnd w:id="10"/>
     <w:bookmarkEnd w:id="11"/>
-    <w:bookmarkStart w:id="13" w:name="marketing-automation-im-team"/>
+    <w:bookmarkStart w:id="14" w:name="marketing-automation-content-im-team"/>
     <w:p>
       <w:pPr>
         <w:pStyle w:val="Heading2"/>
       </w:pPr>
       <w:r>
-        <w:t xml:space="preserve">Marketing-Automation im Team</w:t>
+        <w:t xml:space="preserve">Marketing-Automation &amp; Content im Team</w:t>
       </w:r>
     </w:p>
     <w:bookmarkStart w:id="12" w:name="Xcd57e6a6ac02f682ca57cd63522996126f945fb"/>
@@ -217,65 +333,103 @@
     </w:p>
     <w:p>
       <w:pPr>
-        <w:pStyle w:val="FirstParagraph"/>
-      </w:pPr>
-      <w:r>
-        <w:t xml:space="preserve">Zweck: Deutschsprachiges KI-Magazin mit Discord-Community.</w:t>
-      </w:r>
-    </w:p>
-    <w:p>
-      <w:pPr>
-        <w:pStyle w:val="Compact"/>
-        <w:numPr>
-          <w:ilvl w:val="0"/>
-          <w:numId w:val="1002"/>
-        </w:numPr>
-      </w:pPr>
-      <w:r>
-        <w:t xml:space="preserve">Newsletter mit Double-Opt-In und Plausible-Events für Anmeldung, Bestätigung und zentrale CTAs implementiert.</w:t>
-      </w:r>
-    </w:p>
-    <w:p>
-      <w:pPr>
-        <w:pStyle w:val="Compact"/>
-        <w:numPr>
-          <w:ilvl w:val="0"/>
-          <w:numId w:val="1002"/>
-        </w:numPr>
-      </w:pPr>
-      <w:r>
-        <w:t xml:space="preserve">Social-Distribution automatisiert: plattformgerechte Social-Post-Pakete aus Artikeln erzeugt; Übergabe an pendpost mit Qualitätsprüfung und Markenregeln aufgebaut; UTM-Konvention und Link-in-Bio-Seite umgesetzt.</w:t>
-      </w:r>
-    </w:p>
-    <w:p>
-      <w:pPr>
-        <w:pStyle w:val="Compact"/>
-        <w:numPr>
-          <w:ilvl w:val="0"/>
-          <w:numId w:val="1002"/>
-        </w:numPr>
-      </w:pPr>
-      <w:r>
-        <w:t xml:space="preserve">Autoren-, FAQ- und HowTo-Markup für Artikel; Referral-Programm mit Codes und Stufen.</w:t>
+        <w:pStyle w:val="Compact"/>
+        <w:numPr>
+          <w:ilvl w:val="0"/>
+          <w:numId w:val="1004"/>
+        </w:numPr>
+      </w:pPr>
+      <w:r>
+        <w:t xml:space="preserve">Newsletter mit Double-Opt-In und Plausible-Events für Anmeldung, Bestätigung und CTAs implementiert.</w:t>
+      </w:r>
+    </w:p>
+    <w:p>
+      <w:pPr>
+        <w:pStyle w:val="Compact"/>
+        <w:numPr>
+          <w:ilvl w:val="0"/>
+          <w:numId w:val="1004"/>
+        </w:numPr>
+      </w:pPr>
+      <w:r>
+        <w:t xml:space="preserve">Social-Distribution: plattformgerechte Social-Post-Pakete aus Artikeln erzeugt; Übergabe an pendpost mit Qualitätsprüfung und Markenregeln aufgebaut; UTM-Konvention und Link-in-Bio-Seite umgesetzt.</w:t>
+      </w:r>
+    </w:p>
+    <w:p>
+      <w:pPr>
+        <w:pStyle w:val="Compact"/>
+        <w:numPr>
+          <w:ilvl w:val="0"/>
+          <w:numId w:val="1004"/>
+        </w:numPr>
+      </w:pPr>
+      <w:r>
+        <w:t xml:space="preserve">Autorenprofile sowie optionale FAQ- und HowTo-Daten in die Artikelausgabe integriert; Referral-Programm.</w:t>
       </w:r>
     </w:p>
     <w:bookmarkEnd w:id="12"/>
+    <w:bookmarkStart w:id="13" w:name="Xdc672514a19f1a8f490c7515c6a5f3fae8d596e"/>
+    <w:p>
+      <w:pPr>
+        <w:pStyle w:val="Heading3"/>
+      </w:pPr>
+      <w:r>
+        <w:t xml:space="preserve">Flowki Studio — Clip-Studio (Teamprojekt, 50 gemergte Pull Requests)</w:t>
+      </w:r>
+    </w:p>
+    <w:p>
+      <w:pPr>
+        <w:pStyle w:val="Compact"/>
+        <w:numPr>
+          <w:ilvl w:val="0"/>
+          <w:numId w:val="1005"/>
+        </w:numPr>
+      </w:pPr>
+      <w:r>
+        <w:t xml:space="preserve">Aus Langvideos werden Shorts: Ausschnitt folgt der sprechenden Person; bis zu drei Schnittvarianten je Clip.</w:t>
+      </w:r>
+    </w:p>
+    <w:p>
+      <w:pPr>
+        <w:pStyle w:val="Compact"/>
+        <w:numPr>
+          <w:ilvl w:val="0"/>
+          <w:numId w:val="1005"/>
+        </w:numPr>
+      </w:pPr>
+      <w:r>
+        <w:t xml:space="preserve">Freigaben: offene Clip-Prüfungen und Blind-Reviews im Dashboard angeschlossen, Freigabeoberflächen verbessert und Publikationsrechte unmittelbar vor dem Versand erneut geprüft.</w:t>
+      </w:r>
+    </w:p>
     <w:bookmarkEnd w:id="13"/>
-    <w:bookmarkStart w:id="14" w:name="weitere-projekte"/>
+    <w:bookmarkEnd w:id="14"/>
+    <w:bookmarkStart w:id="15" w:name="webdesign-kreativ-ki-werkzeuge"/>
     <w:p>
       <w:pPr>
         <w:pStyle w:val="Heading2"/>
       </w:pPr>
       <w:r>
-        <w:t xml:space="preserve">Weitere Projekte</w:t>
-      </w:r>
-    </w:p>
-    <w:p>
-      <w:pPr>
-        <w:pStyle w:val="Compact"/>
-        <w:numPr>
-          <w:ilvl w:val="0"/>
-          <w:numId w:val="1003"/>
+        <w:t xml:space="preserve">Webdesign, Kreativ-KI &amp; Werkzeuge</w:t>
+      </w:r>
+    </w:p>
+    <w:p>
+      <w:pPr>
+        <w:pStyle w:val="Compact"/>
+        <w:numPr>
+          <w:ilvl w:val="0"/>
+          <w:numId w:val="1006"/>
+        </w:numPr>
+      </w:pPr>
+      <w:r>
+        <w:t xml:space="preserve">AtopicV — Shopify-Theme auf Horizon-Basis gestaltet: Produktgeschichte in Kapiteln, bearbeitete Produktmotive, mobile Kaufleiste, besserer Tastaturfokus und Touch-Ziele. Unveröffentlichter Entwurf.</w:t>
+      </w:r>
+    </w:p>
+    <w:p>
+      <w:pPr>
+        <w:pStyle w:val="Compact"/>
+        <w:numPr>
+          <w:ilvl w:val="0"/>
+          <w:numId w:val="1006"/>
         </w:numPr>
       </w:pPr>
       <w:r>
@@ -287,39 +441,39 @@
         <w:pStyle w:val="Compact"/>
         <w:numPr>
           <w:ilvl w:val="0"/>
-          <w:numId w:val="1003"/>
-        </w:numPr>
-      </w:pPr>
-      <w:r>
-        <w:t xml:space="preserve">Flowki Studio — Clip-Studio (Teamprojekt): internes Social-Media-Studio mit Trends, Plattform-Playbooks und KI-Content-Pipeline; mein Schwerpunkt: aus Langvideos werden Shorts. 50 gemergte Pull Requests.</w:t>
-      </w:r>
-    </w:p>
-    <w:p>
-      <w:pPr>
-        <w:pStyle w:val="Compact"/>
-        <w:numPr>
-          <w:ilvl w:val="0"/>
-          <w:numId w:val="1003"/>
-        </w:numPr>
-      </w:pPr>
-      <w:r>
-        <w:t xml:space="preserve">Redesign-Entwurf für ein Hamburger Izakaya: Design-Brief geschrieben, KI-Website-Builder gesteuert und selbst nachgearbeitet — Kamerafahrten aus echten Fotos, Farbkorrektur, Übergänge.</w:t>
-      </w:r>
-    </w:p>
-    <w:p>
-      <w:pPr>
-        <w:pStyle w:val="Compact"/>
-        <w:numPr>
-          <w:ilvl w:val="0"/>
-          <w:numId w:val="1003"/>
-        </w:numPr>
-      </w:pPr>
-      <w:r>
-        <w:t xml:space="preserve">KI-gestützte Bewerbungsverwaltung (Eigenprojekt): Python-Pipeline von der Stellensuche bis zur Antwortzuordnung. Eine überarbeitete LLM-Analyse habe ich nach unvollständiger Messung ohne belegte Verbesserung nicht ausgerollt.</w:t>
-      </w:r>
-    </w:p>
-    <w:bookmarkEnd w:id="14"/>
-    <w:bookmarkStart w:id="17" w:name="berufserfahrung"/>
+          <w:numId w:val="1006"/>
+        </w:numPr>
+      </w:pPr>
+      <w:r>
+        <w:t xml:space="preserve">GEO-Landingpage — WebGL-Hero, animierter Einstieg und leichte Mobil-/Reduced-Motion-Variante; Oberflächentests und Referenz-Screenshots angelegt. Nicht veröffentlicht.</w:t>
+      </w:r>
+    </w:p>
+    <w:p>
+      <w:pPr>
+        <w:pStyle w:val="Compact"/>
+        <w:numPr>
+          <w:ilvl w:val="0"/>
+          <w:numId w:val="1006"/>
+        </w:numPr>
+      </w:pPr>
+      <w:r>
+        <w:t xml:space="preserve">Kreativ-KI — Redesign-Entwurf für ein Hamburger Izakaya mit KI-Website-Builder, selbst nachgearbeitet; Vergleichsworkflow für vier KI-Videomodelle mit gemeinsamem Ausgangsprompt.</w:t>
+      </w:r>
+    </w:p>
+    <w:p>
+      <w:pPr>
+        <w:pStyle w:val="Compact"/>
+        <w:numPr>
+          <w:ilvl w:val="0"/>
+          <w:numId w:val="1006"/>
+        </w:numPr>
+      </w:pPr>
+      <w:r>
+        <w:t xml:space="preserve">SEO-Dashboard (Prototyp) — Python-Werkzeug, das Search-Console-, GA4- und Bing-Daten zusammenführt und regelbasierte Hinweise erzeugt.</w:t>
+      </w:r>
+    </w:p>
+    <w:bookmarkEnd w:id="15"/>
+    <w:bookmarkStart w:id="18" w:name="berufserfahrung"/>
     <w:p>
       <w:pPr>
         <w:pStyle w:val="Heading2"/>
@@ -328,7 +482,7 @@
         <w:t xml:space="preserve">Berufserfahrung</w:t>
       </w:r>
     </w:p>
-    <w:bookmarkStart w:id="15" w:name="e-commerce-webentwicklung-ki-automation"/>
+    <w:bookmarkStart w:id="16" w:name="e-commerce-webentwicklung-ki-automation"/>
     <w:p>
       <w:pPr>
         <w:pStyle w:val="Heading3"/>
@@ -354,27 +508,27 @@
         <w:pStyle w:val="Compact"/>
         <w:numPr>
           <w:ilvl w:val="0"/>
-          <w:numId w:val="1004"/>
-        </w:numPr>
-      </w:pPr>
-      <w:r>
-        <w:t xml:space="preserve">Shopify-Shop technisch und im Marketing betreut: Theme, SEO, Produktdaten, E-Mail-Flows, Messung.</w:t>
-      </w:r>
-    </w:p>
-    <w:p>
-      <w:pPr>
-        <w:pStyle w:val="Compact"/>
-        <w:numPr>
-          <w:ilvl w:val="0"/>
-          <w:numId w:val="1004"/>
+          <w:numId w:val="1007"/>
+        </w:numPr>
+      </w:pPr>
+      <w:r>
+        <w:t xml:space="preserve">Shopify-Shop technisch und im Marketing betreut: Theme, SEO, Sprachen, Produktdaten, E-Mail-Flows, Messung.</w:t>
+      </w:r>
+    </w:p>
+    <w:p>
+      <w:pPr>
+        <w:pStyle w:val="Compact"/>
+        <w:numPr>
+          <w:ilvl w:val="0"/>
+          <w:numId w:val="1007"/>
         </w:numPr>
       </w:pPr>
       <w:r>
         <w:t xml:space="preserve">Python-Backends und Next.js-Frontends entwickelt und auf Linux-Servern betrieben; im Team über Branches, Pull Requests und gemeinsame Test-Suites.</w:t>
       </w:r>
     </w:p>
-    <w:bookmarkEnd w:id="15"/>
-    <w:bookmarkStart w:id="16" w:name="b2b-direktvertrieb-door-to-door"/>
+    <w:bookmarkEnd w:id="16"/>
+    <w:bookmarkStart w:id="17" w:name="b2b-direktvertrieb-door-to-door"/>
     <w:p>
       <w:pPr>
         <w:pStyle w:val="Heading3"/>
@@ -400,42 +554,42 @@
         <w:pStyle w:val="Compact"/>
         <w:numPr>
           <w:ilvl w:val="0"/>
-          <w:numId w:val="1005"/>
-        </w:numPr>
-      </w:pPr>
-      <w:r>
-        <w:t xml:space="preserve">Kaltakquise und Bedarfsgespräche direkt mit Inhabern und Geschäftsführern, Verhandlung und Abschluss vor Ort.</w:t>
-      </w:r>
-    </w:p>
-    <w:p>
-      <w:pPr>
-        <w:pStyle w:val="Compact"/>
-        <w:numPr>
-          <w:ilvl w:val="0"/>
-          <w:numId w:val="1005"/>
+          <w:numId w:val="1008"/>
+        </w:numPr>
+      </w:pPr>
+      <w:r>
+        <w:t xml:space="preserve">Kaltakquise und Bedarfsgespräche mit Inhabern und Geschäftsführern, Verhandlung und Abschluss vor Ort.</w:t>
+      </w:r>
+    </w:p>
+    <w:p>
+      <w:pPr>
+        <w:pStyle w:val="Compact"/>
+        <w:numPr>
+          <w:ilvl w:val="0"/>
+          <w:numId w:val="1008"/>
         </w:numPr>
       </w:pPr>
       <w:r>
         <w:t xml:space="preserve">Täglicher Umgang mit Absagen — und der Blick dafür, welche Probleme ein Betrieb wirklich hat.</w:t>
       </w:r>
     </w:p>
-    <w:bookmarkEnd w:id="16"/>
     <w:bookmarkEnd w:id="17"/>
-    <w:bookmarkStart w:id="19" w:name="Xf351a18b3971266fe8c4c9ebe8ae39fb9cba0db"/>
+    <w:bookmarkEnd w:id="18"/>
+    <w:bookmarkStart w:id="20" w:name="zertifikat-weiterbildung"/>
     <w:p>
       <w:pPr>
         <w:pStyle w:val="Heading2"/>
       </w:pPr>
       <w:r>
-        <w:t xml:space="preserve">Zertifikat, Weiterbildung und Projektpraxis</w:t>
-      </w:r>
-    </w:p>
-    <w:p>
-      <w:pPr>
-        <w:pStyle w:val="Compact"/>
-        <w:numPr>
-          <w:ilvl w:val="0"/>
-          <w:numId w:val="1006"/>
+        <w:t xml:space="preserve">Zertifikat &amp; Weiterbildung</w:t>
+      </w:r>
+    </w:p>
+    <w:p>
+      <w:pPr>
+        <w:pStyle w:val="Compact"/>
+        <w:numPr>
+          <w:ilvl w:val="0"/>
+          <w:numId w:val="1009"/>
         </w:numPr>
       </w:pPr>
       <w:r>
@@ -444,7 +598,7 @@
       <w:r>
         <w:t xml:space="preserve"> </w:t>
       </w:r>
-      <w:hyperlink r:id="rId18">
+      <w:hyperlink r:id="rId19">
         <w:r>
           <w:rPr>
             <w:rStyle w:val="Hyperlink"/>
@@ -458,27 +612,15 @@
         <w:pStyle w:val="Compact"/>
         <w:numPr>
           <w:ilvl w:val="0"/>
-          <w:numId w:val="1006"/>
+          <w:numId w:val="1009"/>
         </w:numPr>
       </w:pPr>
       <w:r>
         <w:t xml:space="preserve">Weiterbildung Webentwicklung, 2024 (6 Monate): HTML, CSS, JavaScript, Web-Architektur</w:t>
       </w:r>
     </w:p>
-    <w:p>
-      <w:pPr>
-        <w:pStyle w:val="Compact"/>
-        <w:numPr>
-          <w:ilvl w:val="0"/>
-          <w:numId w:val="1006"/>
-        </w:numPr>
-      </w:pPr>
-      <w:r>
-        <w:t xml:space="preserve">Laufende autodidaktische Weiterbildung anhand eigener und gemeinsamer Projekte</w:t>
-      </w:r>
-    </w:p>
-    <w:bookmarkEnd w:id="19"/>
-    <w:bookmarkStart w:id="20" w:name="kenntnisse-in-projekten-eingesetzt"/>
+    <w:bookmarkEnd w:id="20"/>
+    <w:bookmarkStart w:id="21" w:name="kenntnisse-in-projekten-eingesetzt"/>
     <w:p>
       <w:pPr>
         <w:pStyle w:val="Heading2"/>
@@ -492,75 +634,51 @@
         <w:pStyle w:val="Compact"/>
         <w:numPr>
           <w:ilvl w:val="0"/>
-          <w:numId w:val="1007"/>
-        </w:numPr>
-      </w:pPr>
-      <w:r>
-        <w:t xml:space="preserve">SEO &amp; Analyse: Google Search Console, GA4, Plausible, strukturierte Daten (schema.org), IndexNow, Lighthouse</w:t>
-      </w:r>
-    </w:p>
-    <w:p>
-      <w:pPr>
-        <w:pStyle w:val="Compact"/>
-        <w:numPr>
-          <w:ilvl w:val="0"/>
-          <w:numId w:val="1007"/>
-        </w:numPr>
-      </w:pPr>
-      <w:r>
-        <w:t xml:space="preserve">E-Commerce: Shopify (Liquid, Metafields, Theme), Google Merchant Center, Microsoft- und Pinterest-Kanal</w:t>
-      </w:r>
-    </w:p>
-    <w:p>
-      <w:pPr>
-        <w:pStyle w:val="Compact"/>
-        <w:numPr>
-          <w:ilvl w:val="0"/>
-          <w:numId w:val="1007"/>
-        </w:numPr>
-      </w:pPr>
-      <w:r>
-        <w:t xml:space="preserve">CRM &amp; E-Mail: Klaviyo-Flows, Newsletter mit Double-Opt-In</w:t>
-      </w:r>
-    </w:p>
-    <w:p>
-      <w:pPr>
-        <w:pStyle w:val="Compact"/>
-        <w:numPr>
-          <w:ilvl w:val="0"/>
-          <w:numId w:val="1007"/>
-        </w:numPr>
-      </w:pPr>
-      <w:r>
-        <w:t xml:space="preserve">SEA: Google Ads (Search-Zertifizierung)</w:t>
-      </w:r>
-    </w:p>
-    <w:p>
-      <w:pPr>
-        <w:pStyle w:val="Compact"/>
-        <w:numPr>
-          <w:ilvl w:val="0"/>
-          <w:numId w:val="1007"/>
-        </w:numPr>
-      </w:pPr>
-      <w:r>
-        <w:t xml:space="preserve">Automation: Python, n8n, KI-Agenten (Claude Code), GitHub Actions</w:t>
-      </w:r>
-    </w:p>
-    <w:p>
-      <w:pPr>
-        <w:pStyle w:val="Compact"/>
-        <w:numPr>
-          <w:ilvl w:val="0"/>
-          <w:numId w:val="1007"/>
-        </w:numPr>
-      </w:pPr>
-      <w:r>
-        <w:t xml:space="preserve">Web: HTML, CSS, JavaScript, TypeScript, Next.js, GSAP</w:t>
-      </w:r>
-    </w:p>
-    <w:bookmarkEnd w:id="20"/>
-    <w:bookmarkStart w:id="21" w:name="sprachen"/>
+          <w:numId w:val="1010"/>
+        </w:numPr>
+      </w:pPr>
+      <w:r>
+        <w:t xml:space="preserve">SEO &amp; Auffindbarkeit: Google Search Console, Bing Webmaster Tools, strukturierte Daten (JSON-LD), Canonicals, Weiterleitungen, IndexNow, interne Verlinkung, Entitäten, llms.txt</w:t>
+      </w:r>
+    </w:p>
+    <w:p>
+      <w:pPr>
+        <w:pStyle w:val="Compact"/>
+        <w:numPr>
+          <w:ilvl w:val="0"/>
+          <w:numId w:val="1010"/>
+        </w:numPr>
+      </w:pPr>
+      <w:r>
+        <w:t xml:space="preserve">Shop &amp; Kunden: Shopify (Liquid, Metafields, Theme, GraphQL-Admin-API), Klaviyo, Google Merchant Center, Microsoft- und Pinterest-Kanal, Google Ads (Search-zertifiziert)</w:t>
+      </w:r>
+    </w:p>
+    <w:p>
+      <w:pPr>
+        <w:pStyle w:val="Compact"/>
+        <w:numPr>
+          <w:ilvl w:val="0"/>
+          <w:numId w:val="1010"/>
+        </w:numPr>
+      </w:pPr>
+      <w:r>
+        <w:t xml:space="preserve">Daten &amp; Automation: GA4, Plausible, Lighthouse, Python, n8n, KI-Agenten (Claude Code), GitHub Actions</w:t>
+      </w:r>
+    </w:p>
+    <w:p>
+      <w:pPr>
+        <w:pStyle w:val="Compact"/>
+        <w:numPr>
+          <w:ilvl w:val="0"/>
+          <w:numId w:val="1010"/>
+        </w:numPr>
+      </w:pPr>
+      <w:r>
+        <w:t xml:space="preserve">Gestaltung &amp; Qualität: HTML, CSS, JavaScript, TypeScript, Next.js, GSAP, WebGL, Oberflächentests, KI-Bild und -Video</w:t>
+      </w:r>
+    </w:p>
+    <w:bookmarkEnd w:id="21"/>
+    <w:bookmarkStart w:id="22" w:name="sprachen"/>
     <w:p>
       <w:pPr>
         <w:pStyle w:val="Heading2"/>
@@ -574,15 +692,15 @@
         <w:pStyle w:val="Compact"/>
         <w:numPr>
           <w:ilvl w:val="0"/>
-          <w:numId w:val="1008"/>
+          <w:numId w:val="1011"/>
         </w:numPr>
       </w:pPr>
       <w:r>
         <w:t xml:space="preserve">Deutsch: Muttersprache · Englisch: B1, Richtung B2 · Polnisch: mündlich</w:t>
       </w:r>
     </w:p>
-    <w:bookmarkEnd w:id="21"/>
     <w:bookmarkEnd w:id="22"/>
+    <w:bookmarkEnd w:id="23"/>
     <w:sectPr>
       <w:footnotePr>
         <w:numRestart w:val="eachSect"/>
@@ -821,6 +939,15 @@
     <w:abstractNumId w:val="991"/>
   </w:num>
   <w:num w:numId="1008">
+    <w:abstractNumId w:val="991"/>
+  </w:num>
+  <w:num w:numId="1009">
+    <w:abstractNumId w:val="991"/>
+  </w:num>
+  <w:num w:numId="1010">
+    <w:abstractNumId w:val="991"/>
+  </w:num>
+  <w:num w:numId="1011">
     <w:abstractNumId w:val="991"/>
   </w:num>
 </w:numbering>

</xml_diff>

<commit_message>
fix(cv): Astra-Review bd9c79a - PR-Zuordnung, Bing-API, Google Ads nur beim Zertifikat, Spalten-Einstiege
- 50 eigene PRs in Flowki Studio (nicht dem Clip-Studio allein zugeschrieben)
- Bing Webmaster Tools als API-Datenauswertung, pendpost -> Veroeffentlichungssystem
- Profil ohne Wiederholung der Fallstudie; Vertriebssatz dafuer
- ATS: Historische Produkt-URLs wieder aufgenommen
- Build: praezisere Meldung bei gescheiterter DOCX-Erzeugung
</commit_message>
<xml_diff>
--- a/ats-cv/Jason_Roschmann_CV_Marketing_ATS.docx
+++ b/ats-cv/Jason_Roschmann_CV_Marketing_ATS.docx
@@ -69,7 +69,7 @@
         <w:pStyle w:val="FirstParagraph"/>
       </w:pPr>
       <w:r>
-        <w:t xml:space="preserve">Ich entwickle und verbessere Shopify-Shops mit Schwerpunkt auf technischem SEO, mehrsprachigen Inhalten und Marketing-Automation. Bei duftkumpels habe ich unter anderem Suchdaten ausgewertet, Themenverknüpfungen aufgebaut, Übersetzungsabläufe implementiert und einen fehlerhaften Klaviyo-Checkout-Link korrigiert. KI nutze ich für Recherche, Umsetzung und Content-Workflows; Befunde prüfe ich anhand von Quelldaten, Tests und Gegenmessungen. Vier Jahre B2B-Direktvertrieb haben mir gezeigt, woran Kaufentscheidungen hängen.</w:t>
+        <w:t xml:space="preserve">Ich entwickle und verbessere Shopify-Shops mit Schwerpunkt auf technischem SEO, mehrsprachigen Inhalten und Marketing-Automation. KI nutze ich für Recherche, Umsetzung und Content-Workflows; Befunde prüfe ich anhand von Quelldaten, Tests und Gegenmessungen. Vier Jahre B2B-Direktvertrieb haben mir gezeigt, woran Kaufentscheidungen hängen.</w:t>
       </w:r>
     </w:p>
     <w:bookmarkEnd w:id="9"/>
@@ -116,7 +116,7 @@
         </w:numPr>
       </w:pPr>
       <w:r>
-        <w:t xml:space="preserve">Search-Console-Auswertung der Suchfragen in DE/EN/FR automatisiert; Titel und Metadaten danach angepasst.</w:t>
+        <w:t xml:space="preserve">Suchdaten: Search-Console-Auswertung der Suchfragen in DE/EN/FR automatisiert; Titel und Metadaten danach angepasst.</w:t>
       </w:r>
     </w:p>
     <w:p>
@@ -181,6 +181,18 @@
     </w:p>
     <w:p>
       <w:pPr>
+        <w:pStyle w:val="Compact"/>
+        <w:numPr>
+          <w:ilvl w:val="0"/>
+          <w:numId w:val="1001"/>
+        </w:numPr>
+      </w:pPr>
+      <w:r>
+        <w:t xml:space="preserve">Historische Produkt-URLs ermittelt und Weiterleitungen für nicht mehr erreichbare Produkte eingerichtet.</w:t>
+      </w:r>
+    </w:p>
+    <w:p>
+      <w:pPr>
         <w:pStyle w:val="FirstParagraph"/>
       </w:pPr>
       <w:r>
@@ -252,7 +264,7 @@
         </w:numPr>
       </w:pPr>
       <w:r>
-        <w:t xml:space="preserve">Klaviyo-Abbruchmail auf wiederherstellbaren Checkout-Link umgestellt; fehlendes Onsite-Embed diagnostiziert, aktiviert.</w:t>
+        <w:t xml:space="preserve">Checkout-Link: Klaviyo-Abbruchmail auf wiederherstellbaren Link umgestellt; fehlendes Onsite-Embed diagnostiziert, aktiviert.</w:t>
       </w:r>
     </w:p>
     <w:p>
@@ -352,7 +364,7 @@
         </w:numPr>
       </w:pPr>
       <w:r>
-        <w:t xml:space="preserve">Social-Distribution: plattformgerechte Social-Post-Pakete aus Artikeln erzeugt; Übergabe an pendpost mit Qualitätsprüfung und Markenregeln aufgebaut; UTM-Konvention und Link-in-Bio-Seite umgesetzt.</w:t>
+        <w:t xml:space="preserve">Social-Distribution: Social-Post-Pakete aus Artikeln erzeugt; Übergabe an das Veröffentlichungssystem mit Qualitätsprüfung und Markenregeln; UTM-Konvention und Link-in-Bio-Seite.</w:t>
       </w:r>
     </w:p>
     <w:p>
@@ -368,13 +380,13 @@
       </w:r>
     </w:p>
     <w:bookmarkEnd w:id="12"/>
-    <w:bookmarkStart w:id="13" w:name="Xdc672514a19f1a8f490c7515c6a5f3fae8d596e"/>
+    <w:bookmarkStart w:id="13" w:name="X7e61b755654290aac4206c7a385d687a0f95778"/>
     <w:p>
       <w:pPr>
         <w:pStyle w:val="Heading3"/>
       </w:pPr>
       <w:r>
-        <w:t xml:space="preserve">Flowki Studio — Clip-Studio (Teamprojekt, 50 gemergte Pull Requests)</w:t>
+        <w:t xml:space="preserve">Flowki Studio — Clip-Studio (Teamprojekt, 50 eigene PRs in Flowki Studio gemergt)</w:t>
       </w:r>
     </w:p>
     <w:p>
@@ -512,7 +524,7 @@
         </w:numPr>
       </w:pPr>
       <w:r>
-        <w:t xml:space="preserve">Shopify-Shop technisch und im Marketing betreut: Theme, SEO, Sprachen, Produktdaten, E-Mail-Flows, Messung.</w:t>
+        <w:t xml:space="preserve">Shopify-Shop technisch und im Marketing betreut: Theme, SEO, Sprachen, Produktdaten, E-Mail, Messung.</w:t>
       </w:r>
     </w:p>
     <w:p>
@@ -638,7 +650,7 @@
         </w:numPr>
       </w:pPr>
       <w:r>
-        <w:t xml:space="preserve">SEO &amp; Auffindbarkeit: Google Search Console, Bing Webmaster Tools, strukturierte Daten (JSON-LD), Canonicals, Weiterleitungen, IndexNow, interne Verlinkung, Entitäten, llms.txt</w:t>
+        <w:t xml:space="preserve">SEO &amp; Auffindbarkeit: Google Search Console, Bing Webmaster Tools (API-Datenauswertung), strukturierte Daten (JSON-LD), Canonicals, Weiterleitungen, IndexNow, interne Verlinkung, Entitäten, llms.txt</w:t>
       </w:r>
     </w:p>
     <w:p>
@@ -650,7 +662,7 @@
         </w:numPr>
       </w:pPr>
       <w:r>
-        <w:t xml:space="preserve">Shop &amp; Kunden: Shopify (Liquid, Metafields, Theme, GraphQL-Admin-API), Klaviyo, Google Merchant Center, Microsoft- und Pinterest-Kanal, Google Ads (Search-zertifiziert)</w:t>
+        <w:t xml:space="preserve">Shop &amp; Kunden: Shopify (Liquid, Metafields, Theme, GraphQL-Admin-API), Klaviyo, Google Merchant Center, Microsoft- und Pinterest-Kanal</w:t>
       </w:r>
     </w:p>
     <w:p>
@@ -674,7 +686,7 @@
         </w:numPr>
       </w:pPr>
       <w:r>
-        <w:t xml:space="preserve">Gestaltung &amp; Qualität: HTML, CSS, JavaScript, TypeScript, Next.js, GSAP, WebGL, Oberflächentests, KI-Bild und -Video</w:t>
+        <w:t xml:space="preserve">Gestaltung &amp; Qualität: HTML, CSS, JavaScript, TypeScript, Next.js, GSAP, WebGL, Oberflächentests, KI-Bild/Video</w:t>
       </w:r>
     </w:p>
     <w:bookmarkEnd w:id="21"/>

</xml_diff>

<commit_message>
feat(cv): Marketing - Kenntnisse & Tools im gaengigen Stil (Kategorien, Standardbegriffe, nur Belegtes)
Snap-Zeilen ohne Sonderbegriffe; Tools-Zeile in der Fallstudie; neu belegt: OnPage, hreflang (geprueft),
Core Web Vitals, UTM, Judge.me, consent-gesteuertes Tracking, KI-Video (Veo, Kling). GEO-Landingpage nur
noch im Web-Atlas. Druck-PDF folgt (Datei im Viewer gesperrt).
</commit_message>
<xml_diff>
--- a/ats-cv/Jason_Roschmann_CV_Marketing_ATS.docx
+++ b/ats-cv/Jason_Roschmann_CV_Marketing_ATS.docx
@@ -52,7 +52,7 @@
         <w:pStyle w:val="BodyText"/>
       </w:pPr>
       <w:r>
-        <w:t xml:space="preserve">Schwerpunkte: Technisches SEO, strukturierte Daten (JSON-LD), GEO/AEO, Google Search Console, GA4, Shopify (Liquid, Metafields), Klaviyo, Google Merchant Center, Python, n8n</w:t>
+        <w:t xml:space="preserve">Schwerpunkte: Technisches SEO, OnPage-SEO, strukturierte Daten (JSON-LD), GEO/AEO, Google Search Console, Google Analytics 4, Shopify (Liquid), Klaviyo, Google Merchant Center, Python, n8n</w:t>
       </w:r>
     </w:p>
     <w:bookmarkStart w:id="9" w:name="profil"/>
@@ -321,6 +321,14 @@
       </w:pPr>
       <w:r>
         <w:t xml:space="preserve">Gegenprüfung statt Annahme: SEO-Verfügbarkeitsaussagen automatisch mit kaufbaren Varianten abgeglichen — zwei falsche korrigiert; einen CSS-Preload-Patch nach ungünstigen Messläufen zurückgerollt; einen KI-Auditbefund zu angeblich fehlenden Grundpreisen anhand von Produktdaten und gerenderter Ausgabe widerlegt.</w:t>
+      </w:r>
+    </w:p>
+    <w:p>
+      <w:pPr>
+        <w:pStyle w:val="BodyText"/>
+      </w:pPr>
+      <w:r>
+        <w:t xml:space="preserve">Tools: Shopify (Liquid, Admin-API), Google Search Console, GA4, Klaviyo, Google Merchant Center, Judge.me, Lighthouse, Python</w:t>
       </w:r>
     </w:p>
     <w:bookmarkEnd w:id="10"/>
@@ -446,18 +454,6 @@
       </w:pPr>
       <w:r>
         <w:t xml:space="preserve">nk247store.de — Kundenprojekt im Team: interaktive Überarbeitung mit Next.js und GSAP; Tabakwerbung nach § 19 TabakerzG aus allen Motiven entfernt. Meine Überarbeitung ist noch nicht veröffentlicht.</w:t>
-      </w:r>
-    </w:p>
-    <w:p>
-      <w:pPr>
-        <w:pStyle w:val="Compact"/>
-        <w:numPr>
-          <w:ilvl w:val="0"/>
-          <w:numId w:val="1006"/>
-        </w:numPr>
-      </w:pPr>
-      <w:r>
-        <w:t xml:space="preserve">GEO-Landingpage — WebGL-Hero, animierter Einstieg und leichte Mobil-/Reduced-Motion-Variante; Oberflächentests und Referenz-Screenshots angelegt. Nicht veröffentlicht.</w:t>
       </w:r>
     </w:p>
     <w:p>
@@ -632,13 +628,13 @@
       </w:r>
     </w:p>
     <w:bookmarkEnd w:id="20"/>
-    <w:bookmarkStart w:id="21" w:name="kenntnisse-in-projekten-eingesetzt"/>
+    <w:bookmarkStart w:id="21" w:name="kenntnisse-tools-in-projekten-eingesetzt"/>
     <w:p>
       <w:pPr>
         <w:pStyle w:val="Heading2"/>
       </w:pPr>
       <w:r>
-        <w:t xml:space="preserve">Kenntnisse (in Projekten eingesetzt)</w:t>
+        <w:t xml:space="preserve">Kenntnisse &amp; Tools (in Projekten eingesetzt)</w:t>
       </w:r>
     </w:p>
     <w:p>
@@ -650,7 +646,7 @@
         </w:numPr>
       </w:pPr>
       <w:r>
-        <w:t xml:space="preserve">SEO &amp; Auffindbarkeit: Google Search Console, Bing Webmaster Tools (API-Datenauswertung), strukturierte Daten (JSON-LD), Canonicals, Weiterleitungen, IndexNow, interne Verlinkung, Entitäten, llms.txt</w:t>
+        <w:t xml:space="preserve">SEO: Technisches SEO, OnPage-SEO, Suchanfragen-Analyse, Indexierung, strukturierte Daten (Schema.org, JSON-LD), interne Verlinkung, Canonicals, 301-Weiterleitungen, hreflang, Core Web Vitals, GEO/AEO</w:t>
       </w:r>
     </w:p>
     <w:p>
@@ -662,7 +658,7 @@
         </w:numPr>
       </w:pPr>
       <w:r>
-        <w:t xml:space="preserve">Shop &amp; Kunden: Shopify (Liquid, Metafields, Theme, GraphQL-Admin-API), Klaviyo, Google Merchant Center, Microsoft- und Pinterest-Kanal</w:t>
+        <w:t xml:space="preserve">Analyse &amp; Tools: Google Search Console, Google Analytics 4, Bing Webmaster Tools (API), Lighthouse, Plausible, IndexNow, UTM-Tracking</w:t>
       </w:r>
     </w:p>
     <w:p>
@@ -674,7 +670,7 @@
         </w:numPr>
       </w:pPr>
       <w:r>
-        <w:t xml:space="preserve">Daten &amp; Automation: GA4, Plausible, Lighthouse, Python, n8n, KI-Agenten (Claude Code), GitHub Actions</w:t>
+        <w:t xml:space="preserve">E-Commerce: Shopify (Theme-Anpassung, Liquid, Metafelder, Admin-API), Google Merchant Center, Produktfeeds, Pinterest- und Microsoft-Kanal, Judge.me</w:t>
       </w:r>
     </w:p>
     <w:p>
@@ -686,7 +682,31 @@
         </w:numPr>
       </w:pPr>
       <w:r>
-        <w:t xml:space="preserve">Gestaltung &amp; Qualität: HTML, CSS, JavaScript, TypeScript, Next.js, GSAP, WebGL, Oberflächentests, KI-Bild/Video</w:t>
+        <w:t xml:space="preserve">E-Mail &amp; CRM: Klaviyo (Flows, Vorlagen, Onsite-Tracking), Newsletter mit Double-Opt-In, consent-gesteuertes Tracking</w:t>
+      </w:r>
+    </w:p>
+    <w:p>
+      <w:pPr>
+        <w:pStyle w:val="Compact"/>
+        <w:numPr>
+          <w:ilvl w:val="0"/>
+          <w:numId w:val="1010"/>
+        </w:numPr>
+      </w:pPr>
+      <w:r>
+        <w:t xml:space="preserve">Web &amp; Automation: HTML, CSS, JavaScript, Next.js, GSAP, Python, n8n, GitHub Actions</w:t>
+      </w:r>
+    </w:p>
+    <w:p>
+      <w:pPr>
+        <w:pStyle w:val="Compact"/>
+        <w:numPr>
+          <w:ilvl w:val="0"/>
+          <w:numId w:val="1010"/>
+        </w:numPr>
+      </w:pPr>
+      <w:r>
+        <w:t xml:space="preserve">KI: Claude und Gemini (LLM-APIs), KI-Agenten (Claude Code), KI-Video (Veo, Kling)</w:t>
       </w:r>
     </w:p>
     <w:bookmarkEnd w:id="21"/>

</xml_diff>

<commit_message>
fix(cv): Marketing-Kenntnisse nach Astra-GO praezisiert
hreflang-Pruefung unter internationalem SEO; Consent konkret fuer Klaviyo-Onsite-Tracking; Gruppe
E-Mail-Marketing & Automation; responsives Webdesign. GSAP raus (fuer Marketing-Stellen unueblich);
ATS-Zeilen wortgleich zum Druck, beide Fassungen 2 Seiten.
</commit_message>
<xml_diff>
--- a/ats-cv/Jason_Roschmann_CV_Marketing_ATS.docx
+++ b/ats-cv/Jason_Roschmann_CV_Marketing_ATS.docx
@@ -96,7 +96,7 @@
         <w:pStyle w:val="FirstParagraph"/>
       </w:pPr>
       <w:r>
-        <w:t xml:space="preserve">Hamburger Nischen-Parfümerie. Mein Teil: Theme, SEO, Mehrsprachigkeit, Produktdaten, E-Mail-Flows und Messung.</w:t>
+        <w:t xml:space="preserve">Hamburger Nischen-Parfümerie. Mein Teil: Theme, SEO, Sprachen, Produktdaten, E-Mail-Flows, Messung.</w:t>
       </w:r>
     </w:p>
     <w:p>
@@ -328,7 +328,7 @@
         <w:pStyle w:val="BodyText"/>
       </w:pPr>
       <w:r>
-        <w:t xml:space="preserve">Tools: Shopify (Liquid, Admin-API), Google Search Console, GA4, Klaviyo, Google Merchant Center, Judge.me, Lighthouse, Python</w:t>
+        <w:t xml:space="preserve">Tools: Shopify, Google Search Console, GA4, Klaviyo, Google Merchant Center, Judge.me, Python</w:t>
       </w:r>
     </w:p>
     <w:bookmarkEnd w:id="10"/>
@@ -646,7 +646,7 @@
         </w:numPr>
       </w:pPr>
       <w:r>
-        <w:t xml:space="preserve">SEO: Technisches SEO, OnPage-SEO, Suchanfragen-Analyse, Indexierung, strukturierte Daten (Schema.org, JSON-LD), interne Verlinkung, Canonicals, 301-Weiterleitungen, hreflang, Core Web Vitals, GEO/AEO</w:t>
+        <w:t xml:space="preserve">SEO: Technisches SEO, OnPage-SEO, Indexierung, strukturierte Daten (JSON-LD), interne Verlinkung, Canonicals, 301-Weiterleitungen, internationales SEO (hreflang-Prüfung), Core Web Vitals, GEO/AEO</w:t>
       </w:r>
     </w:p>
     <w:p>
@@ -682,7 +682,7 @@
         </w:numPr>
       </w:pPr>
       <w:r>
-        <w:t xml:space="preserve">E-Mail &amp; CRM: Klaviyo (Flows, Vorlagen, Onsite-Tracking), Newsletter mit Double-Opt-In, consent-gesteuertes Tracking</w:t>
+        <w:t xml:space="preserve">E-Mail-Marketing &amp; Automation: Klaviyo (Flows, Vorlagen, consent-gesteuertes Onsite-Tracking), Double-Opt-In-Newsletter</w:t>
       </w:r>
     </w:p>
     <w:p>
@@ -694,7 +694,7 @@
         </w:numPr>
       </w:pPr>
       <w:r>
-        <w:t xml:space="preserve">Web &amp; Automation: HTML, CSS, JavaScript, Next.js, GSAP, Python, n8n, GitHub Actions</w:t>
+        <w:t xml:space="preserve">Web &amp; Automation: HTML, CSS, JavaScript, responsives Webdesign, Next.js, Python, n8n, GitHub Actions</w:t>
       </w:r>
     </w:p>
     <w:p>

</xml_diff>

<commit_message>
feat(cv): Marketing-CV v4 im Design B - duftkumpels zuerst, FlowKI Club als Mitgruender inkl. Outreach
Pruefskript prueft zusaetzlich Beschriftungspaare und verwaiste Tools-Zeilen (Astra-Befund);
Beschriftungen in Schrift des Inhalts, damit Poppler sie davor extrahiert.
</commit_message>
<xml_diff>
--- a/ats-cv/Jason_Roschmann_CV_Marketing_ATS.docx
+++ b/ats-cv/Jason_Roschmann_CV_Marketing_ATS.docx
@@ -2,7 +2,7 @@
 <file path=word/document.xml><?xml version="1.0" encoding="utf-8"?>
 <w:document xmlns:w="http://schemas.openxmlformats.org/wordprocessingml/2006/main" xmlns:m="http://schemas.openxmlformats.org/officeDocument/2006/math" xmlns:r="http://schemas.openxmlformats.org/officeDocument/2006/relationships" xmlns:o="urn:schemas-microsoft-com:office:office" xmlns:v="urn:schemas-microsoft-com:vml" xmlns:w10="urn:schemas-microsoft-com:office:word" xmlns:a="http://schemas.openxmlformats.org/drawingml/2006/main" xmlns:pic="http://schemas.openxmlformats.org/drawingml/2006/picture" xmlns:wp="http://schemas.openxmlformats.org/drawingml/2006/wordprocessingDrawing">
   <w:body>
-    <w:bookmarkStart w:id="23" w:name="jason-roschmann"/>
+    <w:bookmarkStart w:id="21" w:name="jason-roschmann"/>
     <w:p>
       <w:pPr>
         <w:pStyle w:val="Heading1"/>
@@ -16,7 +16,7 @@
         <w:pStyle w:val="FirstParagraph"/>
       </w:pPr>
       <w:r>
-        <w:t xml:space="preserve">Junior E-Commerce &amp; Technical SEO · Shopify · Marketing-Automation</w:t>
+        <w:t xml:space="preserve">Junior E-Commerce &amp; Technical SEO · Shopify · Marketing-Automation · KI-Community</w:t>
       </w:r>
     </w:p>
     <w:p>
@@ -24,7 +24,19 @@
         <w:pStyle w:val="BodyText"/>
       </w:pPr>
       <w:r>
-        <w:t xml:space="preserve">Ich verbinde Suchdaten, Shop-Entwicklung und Automatisierung – und prüfe die Änderungen am tatsächlichen System.</w:t>
+        <w:t xml:space="preserve">E-Mail: jason@roschmann-digital.de | Telefon: +49 155 612 953 91</w:t>
+      </w:r>
+      <w:r>
+        <w:br/>
+      </w:r>
+      <w:r>
+        <w:t xml:space="preserve">LinkedIn: linkedin.com/in/jason-roschmann-1091512b2 | GitHub: github.com/JasonRoschmann | Web-CV: jasonroschmann.github.io/cv</w:t>
+      </w:r>
+      <w:r>
+        <w:br/>
+      </w:r>
+      <w:r>
+        <w:t xml:space="preserve">Wohnort: Hamburg, Deutschland | Gesucht: Hamburg oder remote; Umzug nach Zürich für eine passende Rolle möglich | Start nach Absprache</w:t>
       </w:r>
     </w:p>
     <w:p>
@@ -32,19 +44,24 @@
         <w:pStyle w:val="BodyText"/>
       </w:pPr>
       <w:r>
-        <w:t xml:space="preserve">E-Mail: jason@roschmann-digital.de | Telefon: +49 155 612 953 91</w:t>
-      </w:r>
-      <w:r>
-        <w:br/>
-      </w:r>
-      <w:r>
-        <w:t xml:space="preserve">LinkedIn: linkedin.com/in/jason-roschmann-1091512b2 | GitHub: github.com/JasonRoschmann | Web-CV: jasonroschmann.github.io/cv</w:t>
-      </w:r>
-      <w:r>
-        <w:br/>
-      </w:r>
-      <w:r>
-        <w:t xml:space="preserve">Wohnort: Hamburg, Deutschland | Gesucht: Hamburg oder remote; Umzug nach Zürich für eine passende Rolle möglich | Start nach Absprache</w:t>
+        <w:t xml:space="preserve">Schwerpunkte: Technisches SEO, OnPage-SEO, strukturierte Daten (JSON-LD), GEO/AEO, Google Search Console, Google Analytics 4, Shopify (Liquid), Klaviyo, Google Merchant Center, Community-Aufbau, Python, n8n</w:t>
+      </w:r>
+    </w:p>
+    <w:bookmarkStart w:id="9" w:name="profil"/>
+    <w:p>
+      <w:pPr>
+        <w:pStyle w:val="Heading2"/>
+      </w:pPr>
+      <w:r>
+        <w:t xml:space="preserve">Profil</w:t>
+      </w:r>
+    </w:p>
+    <w:p>
+      <w:pPr>
+        <w:pStyle w:val="FirstParagraph"/>
+      </w:pPr>
+      <w:r>
+        <w:t xml:space="preserve">Ich verbinde Kundenverständnis aus vier Jahren B2B-Direktvertrieb mit technischer Projektarbeit an Shopify-Shops, mehrsprachigen Inhalten und Marketing-Automation. Im Kundenprojekt bearbeite ich Suchdaten, Produktinformationen, E-Mail-Flows und Messung; als Mitgründer des FlowKI Clubs baue ich eine KI-Community mit auf und verbinde sie mit Website, Outreach und Automatisierung.</w:t>
       </w:r>
     </w:p>
     <w:p>
@@ -52,16 +69,26 @@
         <w:pStyle w:val="BodyText"/>
       </w:pPr>
       <w:r>
-        <w:t xml:space="preserve">Schwerpunkte: Technisches SEO, OnPage-SEO, strukturierte Daten (JSON-LD), GEO/AEO, Google Search Console, Google Analytics 4, Shopify (Liquid), Klaviyo, Google Merchant Center, Python, n8n</w:t>
-      </w:r>
-    </w:p>
-    <w:bookmarkStart w:id="9" w:name="profil"/>
+        <w:t xml:space="preserve">Kennzahlen: 700 URLs auf Indexierung geprüft (Kundenshop duftkumpels) · rund 66 Discord-Mitglieder FlowKI Club (Stand 29.09.2026) · 4 Jahre B2B-Vertrieb mit täglichem Kundenkontakt (2019–2023) · Google Ads Search zertifiziert (verifizierbar)</w:t>
+      </w:r>
+    </w:p>
+    <w:bookmarkEnd w:id="9"/>
+    <w:bookmarkStart w:id="13" w:name="projekte-praxis"/>
     <w:p>
       <w:pPr>
         <w:pStyle w:val="Heading2"/>
       </w:pPr>
       <w:r>
-        <w:t xml:space="preserve">Profil</w:t>
+        <w:t xml:space="preserve">Projekte &amp; Praxis</w:t>
+      </w:r>
+    </w:p>
+    <w:bookmarkStart w:id="10" w:name="X84940916fb7ba001686bb93c7261d73c1df2a71"/>
+    <w:p>
+      <w:pPr>
+        <w:pStyle w:val="Heading3"/>
+      </w:pPr>
+      <w:r>
+        <w:t xml:space="preserve">duftkumpels.shop — Kundenprojekt, Shopify DE/EN/FR (Juni 2026 – heute)</w:t>
       </w:r>
     </w:p>
     <w:p>
@@ -69,492 +96,476 @@
         <w:pStyle w:val="FirstParagraph"/>
       </w:pPr>
       <w:r>
-        <w:t xml:space="preserve">Ich entwickle und verbessere Shopify-Shops mit Schwerpunkt auf technischem SEO, mehrsprachigen Inhalten und Marketing-Automation. KI nutze ich für Recherche, Umsetzung und Content-Workflows; Befunde prüfe ich anhand von Quelldaten, Tests und Gegenmessungen. Vier Jahre B2B-Direktvertrieb mit täglichem Kundenkontakt haben mir gezeigt, woran Kaufentscheidungen hängen.</w:t>
-      </w:r>
-    </w:p>
-    <w:bookmarkEnd w:id="9"/>
-    <w:bookmarkStart w:id="11" w:name="fallstudie-e-commerce-seo"/>
+        <w:t xml:space="preserve">Zweck: Shopify-Shop einer Hamburger Nischen-Parfümerie; mein Teil: Theme, SEO, Sprachen, Produktdaten, E-Mail-Flows und Messung.</w:t>
+      </w:r>
+    </w:p>
+    <w:p>
+      <w:pPr>
+        <w:pStyle w:val="Compact"/>
+        <w:numPr>
+          <w:ilvl w:val="0"/>
+          <w:numId w:val="1001"/>
+        </w:numPr>
+      </w:pPr>
+      <w:r>
+        <w:t xml:space="preserve">Gefunden werden: Search-Console-Auswertung der Suchfragen in DE/EN/FR automatisiert, Titel und Metadaten danach angepasst; Indexierungsstatus von 700 URLs geprüft und die Bearbeitung priorisiert.</w:t>
+      </w:r>
+    </w:p>
+    <w:p>
+      <w:pPr>
+        <w:pStyle w:val="Compact"/>
+        <w:numPr>
+          <w:ilvl w:val="0"/>
+          <w:numId w:val="1001"/>
+        </w:numPr>
+      </w:pPr>
+      <w:r>
+        <w:t xml:space="preserve">Struktur &amp; Daten: Themenindex für 128 Artikel aufgebaut und mit 60 Produkten über Metafelder verknüpft; Canonical-Ziele für 19 überlappende Blogartikel gesetzt; strukturierte Daten in JSON-LD ergänzt und automatisiert geprüft.</w:t>
+      </w:r>
+    </w:p>
+    <w:p>
+      <w:pPr>
+        <w:pStyle w:val="Compact"/>
+        <w:numPr>
+          <w:ilvl w:val="0"/>
+          <w:numId w:val="1001"/>
+        </w:numPr>
+      </w:pPr>
+      <w:r>
+        <w:t xml:space="preserve">GEO/AEO: Seiten an zehn Käuferfragen auf direkt auffindbare Antworten geprüft, Lücken dokumentiert; llms.txt um Kataloginformationen erweitert.</w:t>
+      </w:r>
+    </w:p>
+    <w:p>
+      <w:pPr>
+        <w:pStyle w:val="Compact"/>
+        <w:numPr>
+          <w:ilvl w:val="0"/>
+          <w:numId w:val="1001"/>
+        </w:numPr>
+      </w:pPr>
+      <w:r>
+        <w:t xml:space="preserve">Mehrsprachigkeit: Übersetzungs-Pipeline mit HTML-Extraktion, Strukturprüfung und Shopify-Import aufgebaut; EN/FR-Artikel nach vorhandenen Suchimpressionen priorisiert.</w:t>
+      </w:r>
+    </w:p>
+    <w:p>
+      <w:pPr>
+        <w:pStyle w:val="Compact"/>
+        <w:numPr>
+          <w:ilvl w:val="0"/>
+          <w:numId w:val="1001"/>
+        </w:numPr>
+      </w:pPr>
+      <w:r>
+        <w:t xml:space="preserve">Shop &amp; Theme: Gekauftes Theme in Liquid, CSS und JavaScript umgebaut; Bildladeprioritäten korrigiert; wöchentliche Lighthouse-Prüfung per GitHub Actions.</w:t>
+      </w:r>
+    </w:p>
+    <w:p>
+      <w:pPr>
+        <w:pStyle w:val="Compact"/>
+        <w:numPr>
+          <w:ilvl w:val="0"/>
+          <w:numId w:val="1001"/>
+        </w:numPr>
+      </w:pPr>
+      <w:r>
+        <w:t xml:space="preserve">Kaufen &amp; nachfassen: Klaviyo-Abbruchmail auf einen wiederherstellbaren Checkout-Link umgestellt; Merchant-Center-Probleme analysiert und Kategorien korrigiert; Microsoft- und Pinterest-Kanal angebunden.</w:t>
+      </w:r>
+    </w:p>
+    <w:p>
+      <w:pPr>
+        <w:pStyle w:val="Compact"/>
+        <w:numPr>
+          <w:ilvl w:val="0"/>
+          <w:numId w:val="1001"/>
+        </w:numPr>
+      </w:pPr>
+      <w:r>
+        <w:t xml:space="preserve">Messung &amp; Gegenprüfung: GA4-Kaufzahlen mit Shopify-Bestellungen abgeglichen; Verfügbarkeitsaussagen automatisch mit kaufbaren Varianten abgeglichen – zwei falsche korrigiert; einen Preload-Patch nach ungünstigen Messläufen zurückgerollt.</w:t>
+      </w:r>
+    </w:p>
+    <w:p>
+      <w:pPr>
+        <w:pStyle w:val="FirstParagraph"/>
+      </w:pPr>
+      <w:r>
+        <w:t xml:space="preserve">Tools: Shopify (Liquid, Admin-API), Google Search Console, GA4, Klaviyo, Merchant Center, Judge.me, Python</w:t>
+      </w:r>
+    </w:p>
+    <w:bookmarkEnd w:id="10"/>
+    <w:bookmarkStart w:id="11" w:name="X7cdf38d595d086d9611592c4822930e8162f252"/>
+    <w:p>
+      <w:pPr>
+        <w:pStyle w:val="Heading3"/>
+      </w:pPr>
+      <w:r>
+        <w:t xml:space="preserve">FlowKI Club — Mitgründer, KI-Community &amp; Magazin (Apr. 2026 – heute)</w:t>
+      </w:r>
+    </w:p>
+    <w:p>
+      <w:pPr>
+        <w:pStyle w:val="FirstParagraph"/>
+      </w:pPr>
+      <w:r>
+        <w:t xml:space="preserve">Zweck: Deutschsprachige KI-Community mit Discord, Fachartikeln und gemeinsamem Projektlernen – rund 66 Mitglieder (Discord, Stand 29.09.2026).</w:t>
+      </w:r>
+    </w:p>
+    <w:p>
+      <w:pPr>
+        <w:pStyle w:val="Compact"/>
+        <w:numPr>
+          <w:ilvl w:val="0"/>
+          <w:numId w:val="1002"/>
+        </w:numPr>
+      </w:pPr>
+      <w:r>
+        <w:t xml:space="preserve">Community-Aufbau: Mitglieder gewonnen und beim Einstieg begleitet, Online-Calls organisiert und moderiert, Themen geplant; Mitglieder bei ihren eigenen KI-Projekten unterstützt.</w:t>
+      </w:r>
+    </w:p>
+    <w:p>
+      <w:pPr>
+        <w:pStyle w:val="Compact"/>
+        <w:numPr>
+          <w:ilvl w:val="0"/>
+          <w:numId w:val="1002"/>
+        </w:numPr>
+      </w:pPr>
+      <w:r>
+        <w:t xml:space="preserve">Outreach &amp; Akquise: Der Club dient auch der Anbahnung potenzieller Kundenaufträge.</w:t>
+      </w:r>
+    </w:p>
+    <w:p>
+      <w:pPr>
+        <w:pStyle w:val="Compact"/>
+        <w:numPr>
+          <w:ilvl w:val="0"/>
+          <w:numId w:val="1002"/>
+        </w:numPr>
+      </w:pPr>
+      <w:r>
+        <w:t xml:space="preserve">Community-Zugang &amp; Messung: Newsletter mit Double-Opt-In und Empfehlungslinks umgesetzt; Plausible-Ereignisse für Anmeldung, Bestätigung und Klicks auf Discord-Beitrittslinks eingebunden – Übergänge von Inhalten zur Community auswertbar gemacht.</w:t>
+      </w:r>
+    </w:p>
+    <w:p>
+      <w:pPr>
+        <w:pStyle w:val="Compact"/>
+        <w:numPr>
+          <w:ilvl w:val="0"/>
+          <w:numId w:val="1002"/>
+        </w:numPr>
+      </w:pPr>
+      <w:r>
+        <w:t xml:space="preserve">Content-Verteilung: Artikel in plattformgerechte Social-Pakete überführt und an die Veröffentlichungsplanung angebunden – Prüfungen auf Textqualität, Länge und Markenregeln vor dem Einplanen.</w:t>
+      </w:r>
+    </w:p>
+    <w:p>
+      <w:pPr>
+        <w:pStyle w:val="Compact"/>
+        <w:numPr>
+          <w:ilvl w:val="0"/>
+          <w:numId w:val="1002"/>
+        </w:numPr>
+      </w:pPr>
+      <w:r>
+        <w:t xml:space="preserve">Community-Werkzeuge: Discord-Bot um /ask und Self-Service-Themenrollen erweitert; Artikelinhalte als Wissensgrundlage des FAQ-Bots angebunden.</w:t>
+      </w:r>
+    </w:p>
+    <w:p>
+      <w:pPr>
+        <w:pStyle w:val="FirstParagraph"/>
+      </w:pPr>
+      <w:r>
+        <w:t xml:space="preserve">Tools: Discord, Next.js, TypeScript, Plausible, Claude-API</w:t>
+      </w:r>
+    </w:p>
+    <w:bookmarkEnd w:id="11"/>
+    <w:bookmarkStart w:id="12" w:name="X40522d7e3ff69a9e05b72646dc5fd212320d02c"/>
+    <w:p>
+      <w:pPr>
+        <w:pStyle w:val="Heading3"/>
+      </w:pPr>
+      <w:r>
+        <w:t xml:space="preserve">Flowki Studio — internes Social-Media-Studio, Teamprojekt (Aug. 2026 – heute)</w:t>
+      </w:r>
+    </w:p>
+    <w:p>
+      <w:pPr>
+        <w:pStyle w:val="FirstParagraph"/>
+      </w:pPr>
+      <w:r>
+        <w:t xml:space="preserve">Zweck: Internes Studio für Themenrecherche, KI-gestützte Content-Produktion, redaktionelle Prüfung und Plattformübergabe; 50 eigene Pull Requests gemergt.</w:t>
+      </w:r>
+    </w:p>
+    <w:p>
+      <w:pPr>
+        <w:pStyle w:val="Compact"/>
+        <w:numPr>
+          <w:ilvl w:val="0"/>
+          <w:numId w:val="1003"/>
+        </w:numPr>
+      </w:pPr>
+      <w:r>
+        <w:t xml:space="preserve">Redaktionelle Zusammenarbeit: Ablehnungsgründe durch Oberfläche, API-Client und Freigabeprotokoll verbunden – Rückgaben zur Überarbeitung mit nachvollziehbarer Begründung.</w:t>
+      </w:r>
+    </w:p>
+    <w:p>
+      <w:pPr>
+        <w:pStyle w:val="Compact"/>
+        <w:numPr>
+          <w:ilvl w:val="0"/>
+          <w:numId w:val="1003"/>
+        </w:numPr>
+      </w:pPr>
+      <w:r>
+        <w:t xml:space="preserve">Produktion &amp; Freigaben: Produktions-, Freigabe- und Veröffentlichungsansichten weiterentwickelt – Bearbeitungsstände und nötige Nutzeraktionen sichtbar gemacht.</w:t>
+      </w:r>
+    </w:p>
+    <w:p>
+      <w:pPr>
+        <w:pStyle w:val="Compact"/>
+        <w:numPr>
+          <w:ilvl w:val="0"/>
+          <w:numId w:val="1003"/>
+        </w:numPr>
+      </w:pPr>
+      <w:r>
+        <w:t xml:space="preserve">Publishing &amp; Video: TikTok-Entwurfsweg mit eigenem Status integriert; Langvideos im Clip-Studio in bearbeitbare Hochformat-Clips überführt.</w:t>
+      </w:r>
+    </w:p>
+    <w:p>
+      <w:pPr>
+        <w:pStyle w:val="FirstParagraph"/>
+      </w:pPr>
+      <w:r>
+        <w:t xml:space="preserve">Tools: Python, FastAPI, Next.js, PostgreSQL</w:t>
+      </w:r>
+    </w:p>
+    <w:bookmarkEnd w:id="12"/>
+    <w:bookmarkEnd w:id="13"/>
+    <w:bookmarkStart w:id="16" w:name="berufserfahrung"/>
     <w:p>
       <w:pPr>
         <w:pStyle w:val="Heading2"/>
       </w:pPr>
       <w:r>
-        <w:t xml:space="preserve">Fallstudie E-Commerce &amp; SEO</w:t>
-      </w:r>
-    </w:p>
-    <w:bookmarkStart w:id="10" w:name="Xf794ea0567facb09dd516c29c08d64e228b88b4"/>
+        <w:t xml:space="preserve">Berufserfahrung</w:t>
+      </w:r>
+    </w:p>
+    <w:bookmarkStart w:id="14" w:name="Xcf46fab96845dd617fc1bd5ae918f2087bb377d"/>
     <w:p>
       <w:pPr>
         <w:pStyle w:val="Heading3"/>
       </w:pPr>
       <w:r>
-        <w:t xml:space="preserve">duftkumpels.shop — Shopify, DE/EN/FR (Kundenprojekt, Projektarbeit seit Juni 2026)</w:t>
-      </w:r>
-    </w:p>
-    <w:p>
-      <w:pPr>
-        <w:pStyle w:val="FirstParagraph"/>
-      </w:pPr>
-      <w:r>
-        <w:t xml:space="preserve">Hamburger Nischen-Parfümerie. Mein Teil: Theme, SEO, Sprachen, Produktdaten, E-Mail-Flows, Messung.</w:t>
-      </w:r>
-    </w:p>
-    <w:p>
-      <w:pPr>
-        <w:pStyle w:val="BodyText"/>
-      </w:pPr>
-      <w:r>
-        <w:t xml:space="preserve">Gefunden werden:</w:t>
-      </w:r>
-    </w:p>
-    <w:p>
-      <w:pPr>
-        <w:pStyle w:val="Compact"/>
-        <w:numPr>
-          <w:ilvl w:val="0"/>
-          <w:numId w:val="1001"/>
-        </w:numPr>
-      </w:pPr>
-      <w:r>
-        <w:t xml:space="preserve">Suchdaten: Search-Console-Auswertung der Suchfragen in DE/EN/FR automatisiert; Titel und Metadaten danach angepasst.</w:t>
-      </w:r>
-    </w:p>
-    <w:p>
-      <w:pPr>
-        <w:pStyle w:val="Compact"/>
-        <w:numPr>
-          <w:ilvl w:val="0"/>
-          <w:numId w:val="1001"/>
-        </w:numPr>
-      </w:pPr>
-      <w:r>
-        <w:t xml:space="preserve">Indexierungsstatus von 700 URLs geprüft, Bearbeitung priorisiert.</w:t>
-      </w:r>
-    </w:p>
-    <w:p>
-      <w:pPr>
-        <w:pStyle w:val="Compact"/>
-        <w:numPr>
-          <w:ilvl w:val="0"/>
-          <w:numId w:val="1001"/>
-        </w:numPr>
-      </w:pPr>
-      <w:r>
-        <w:t xml:space="preserve">Themenindex für 128 Artikel aufgebaut; Artikel und 60 Produkte über Metafelder verknüpft.</w:t>
-      </w:r>
-    </w:p>
-    <w:p>
-      <w:pPr>
-        <w:pStyle w:val="Compact"/>
-        <w:numPr>
-          <w:ilvl w:val="0"/>
-          <w:numId w:val="1001"/>
-        </w:numPr>
-      </w:pPr>
-      <w:r>
-        <w:t xml:space="preserve">Canonical-Ziele für 19 thematisch überlappende Blogartikel gesetzt.</w:t>
-      </w:r>
-    </w:p>
-    <w:p>
-      <w:pPr>
-        <w:pStyle w:val="Compact"/>
-        <w:numPr>
-          <w:ilvl w:val="0"/>
-          <w:numId w:val="1001"/>
-        </w:numPr>
-      </w:pPr>
-      <w:r>
-        <w:t xml:space="preserve">Artikel-, Blog-, Listen-, Person- und Organisationsdaten in JSON-LD ergänzt und automatisiert geprüft.</w:t>
-      </w:r>
-    </w:p>
-    <w:p>
-      <w:pPr>
-        <w:pStyle w:val="Compact"/>
-        <w:numPr>
-          <w:ilvl w:val="0"/>
-          <w:numId w:val="1001"/>
-        </w:numPr>
-      </w:pPr>
-      <w:r>
-        <w:t xml:space="preserve">GEO/AEO: Seiten anhand von zehn Käuferfragen auf direkt auffindbare Antworten geprüft und Inhaltslücken dokumentiert; bestehende llms.txt-Ausgabe um aktuelle Kataloginformationen erweitert.</w:t>
-      </w:r>
-    </w:p>
-    <w:p>
-      <w:pPr>
-        <w:pStyle w:val="Compact"/>
-        <w:numPr>
-          <w:ilvl w:val="0"/>
-          <w:numId w:val="1001"/>
-        </w:numPr>
-      </w:pPr>
-      <w:r>
-        <w:t xml:space="preserve">Historische Produkt-URLs ermittelt und Weiterleitungen für nicht mehr erreichbare Produkte eingerichtet.</w:t>
-      </w:r>
-    </w:p>
-    <w:p>
-      <w:pPr>
-        <w:pStyle w:val="FirstParagraph"/>
-      </w:pPr>
-      <w:r>
-        <w:t xml:space="preserve">In mehreren Sprachen:</w:t>
-      </w:r>
-    </w:p>
-    <w:p>
-      <w:pPr>
-        <w:pStyle w:val="Compact"/>
-        <w:numPr>
-          <w:ilvl w:val="0"/>
-          <w:numId w:val="1002"/>
-        </w:numPr>
-      </w:pPr>
-      <w:r>
-        <w:t xml:space="preserve">Übersetzungs-Pipeline aufgebaut: HTML-Extraktion, Strukturprüfung, Shopify-Import über CSV bzw. GraphQL.</w:t>
-      </w:r>
-    </w:p>
-    <w:p>
-      <w:pPr>
-        <w:pStyle w:val="Compact"/>
-        <w:numPr>
-          <w:ilvl w:val="0"/>
-          <w:numId w:val="1002"/>
-        </w:numPr>
-      </w:pPr>
-      <w:r>
-        <w:t xml:space="preserve">EN/FR-Artikel anhand vorhandener Suchimpressionen priorisiert und eingespielt.</w:t>
-      </w:r>
-    </w:p>
-    <w:p>
-      <w:pPr>
-        <w:pStyle w:val="Compact"/>
-        <w:numPr>
-          <w:ilvl w:val="0"/>
-          <w:numId w:val="1002"/>
-        </w:numPr>
-      </w:pPr>
-      <w:r>
-        <w:t xml:space="preserve">Produktnamen sprachübergreifend vereinheitlicht; Produkttypen, Kollektionstitel und Hero-Texte lokalisiert.</w:t>
-      </w:r>
-    </w:p>
-    <w:p>
-      <w:pPr>
-        <w:pStyle w:val="Compact"/>
-        <w:numPr>
-          <w:ilvl w:val="0"/>
-          <w:numId w:val="1002"/>
-        </w:numPr>
-      </w:pPr>
-      <w:r>
-        <w:t xml:space="preserve">Fehlerhafte EN/FR-Sprachweiterleitungen reproduziert und auf das Shopify-Routing eingegrenzt.</w:t>
-      </w:r>
-    </w:p>
-    <w:p>
-      <w:pPr>
-        <w:pStyle w:val="FirstParagraph"/>
-      </w:pPr>
-      <w:r>
-        <w:t xml:space="preserve">Kaufen und nachfassen:</w:t>
-      </w:r>
-    </w:p>
-    <w:p>
-      <w:pPr>
-        <w:pStyle w:val="Compact"/>
-        <w:numPr>
-          <w:ilvl w:val="0"/>
-          <w:numId w:val="1003"/>
-        </w:numPr>
-      </w:pPr>
-      <w:r>
-        <w:t xml:space="preserve">Checkout-Link: Klaviyo-Abbruchmail auf wiederherstellbaren Link umgestellt; fehlendes Onsite-Embed diagnostiziert, aktiviert.</w:t>
-      </w:r>
-    </w:p>
-    <w:p>
-      <w:pPr>
-        <w:pStyle w:val="Compact"/>
-        <w:numPr>
-          <w:ilvl w:val="0"/>
-          <w:numId w:val="1003"/>
-        </w:numPr>
-      </w:pPr>
-      <w:r>
-        <w:t xml:space="preserve">Merchant-Center-Probleme analysiert, Kategorien und Zuordnung korrigiert; Microsoft- und Pinterest-Kanal angebunden.</w:t>
-      </w:r>
-    </w:p>
-    <w:p>
-      <w:pPr>
-        <w:pStyle w:val="Compact"/>
-        <w:numPr>
-          <w:ilvl w:val="0"/>
-          <w:numId w:val="1003"/>
-        </w:numPr>
-      </w:pPr>
-      <w:r>
-        <w:t xml:space="preserve">Nicht lieferbare Produkte auf Wissensseiten gekennzeichnet, verfügbare Alternativen eingeblendet.</w:t>
-      </w:r>
-    </w:p>
-    <w:p>
-      <w:pPr>
-        <w:pStyle w:val="Compact"/>
-        <w:numPr>
-          <w:ilvl w:val="0"/>
-          <w:numId w:val="1003"/>
-        </w:numPr>
-      </w:pPr>
-      <w:r>
-        <w:t xml:space="preserve">GA4-Kaufzahlen mit Shopify-Bestellungen abgeglichen.</w:t>
-      </w:r>
-    </w:p>
-    <w:p>
-      <w:pPr>
-        <w:pStyle w:val="Compact"/>
-        <w:numPr>
-          <w:ilvl w:val="0"/>
-          <w:numId w:val="1003"/>
-        </w:numPr>
-      </w:pPr>
-      <w:r>
-        <w:t xml:space="preserve">Gekauftes Theme in Liquid, CSS und JavaScript umgebaut; Bildladeprioritäten korrigiert; wöchentliche Lighthouse-Prüfung per GitHub Actions.</w:t>
-      </w:r>
-    </w:p>
-    <w:p>
-      <w:pPr>
-        <w:pStyle w:val="FirstParagraph"/>
-      </w:pPr>
-      <w:r>
-        <w:t xml:space="preserve">Gegenprüfung statt Annahme: SEO-Verfügbarkeitsaussagen automatisch mit kaufbaren Varianten abgeglichen — zwei falsche korrigiert; einen CSS-Preload-Patch nach ungünstigen Messläufen zurückgerollt; einen KI-Auditbefund zu angeblich fehlenden Grundpreisen anhand von Produktdaten und gerenderter Ausgabe widerlegt.</w:t>
-      </w:r>
-    </w:p>
-    <w:p>
-      <w:pPr>
-        <w:pStyle w:val="BodyText"/>
-      </w:pPr>
-      <w:r>
-        <w:t xml:space="preserve">Tools: Shopify, Google Search Console, GA4, Klaviyo, Google Merchant Center, Judge.me, Python</w:t>
-      </w:r>
-    </w:p>
-    <w:bookmarkEnd w:id="10"/>
-    <w:bookmarkEnd w:id="11"/>
-    <w:bookmarkStart w:id="14" w:name="marketing-automation-content-im-team"/>
+        <w:t xml:space="preserve">E-Commerce, Webentwicklung &amp; KI-Automation — Eigene Projekte, Team- und Kundenprojekte, Hamburg / remote (2024 – heute)</w:t>
+      </w:r>
+    </w:p>
+    <w:p>
+      <w:pPr>
+        <w:pStyle w:val="Compact"/>
+        <w:numPr>
+          <w:ilvl w:val="0"/>
+          <w:numId w:val="1004"/>
+        </w:numPr>
+      </w:pPr>
+      <w:r>
+        <w:t xml:space="preserve">Shopify-Shop technisch und im Marketing betreut: Theme, SEO, Sprachen, Produktdaten, E-Mail-Flows, Messung.</w:t>
+      </w:r>
+    </w:p>
+    <w:p>
+      <w:pPr>
+        <w:pStyle w:val="Compact"/>
+        <w:numPr>
+          <w:ilvl w:val="0"/>
+          <w:numId w:val="1004"/>
+        </w:numPr>
+      </w:pPr>
+      <w:r>
+        <w:t xml:space="preserve">Python-Backends und Next.js-Frontends entwickelt und auf Linux-Servern betrieben; im Team über Branches, Pull Requests und gemeinsame Test-Suites.</w:t>
+      </w:r>
+    </w:p>
+    <w:bookmarkEnd w:id="14"/>
+    <w:bookmarkStart w:id="15" w:name="X1915a06831d154184e90fcc133d22bf8aaac68c"/>
+    <w:p>
+      <w:pPr>
+        <w:pStyle w:val="Heading3"/>
+      </w:pPr>
+      <w:r>
+        <w:t xml:space="preserve">B2B-Direktvertrieb — Außendienst bundesweit, EWE TEL und Ranger Marketing (2019 – 2023)</w:t>
+      </w:r>
+    </w:p>
+    <w:p>
+      <w:pPr>
+        <w:pStyle w:val="Compact"/>
+        <w:numPr>
+          <w:ilvl w:val="0"/>
+          <w:numId w:val="1005"/>
+        </w:numPr>
+      </w:pPr>
+      <w:r>
+        <w:t xml:space="preserve">Kaltakquise und Bedarfsgespräche mit Inhabern und Geschäftsführern, Verhandlung und Abschluss vor Ort.</w:t>
+      </w:r>
+    </w:p>
+    <w:p>
+      <w:pPr>
+        <w:pStyle w:val="Compact"/>
+        <w:numPr>
+          <w:ilvl w:val="0"/>
+          <w:numId w:val="1005"/>
+        </w:numPr>
+      </w:pPr>
+      <w:r>
+        <w:t xml:space="preserve">Täglicher Umgang mit Absagen – und der Blick dafür, welche Probleme ein Betrieb wirklich hat.</w:t>
+      </w:r>
+    </w:p>
+    <w:bookmarkEnd w:id="15"/>
+    <w:bookmarkEnd w:id="16"/>
+    <w:bookmarkStart w:id="17" w:name="weitere-web--shop-projekte"/>
     <w:p>
       <w:pPr>
         <w:pStyle w:val="Heading2"/>
       </w:pPr>
       <w:r>
-        <w:t xml:space="preserve">Marketing-Automation &amp; Content im Team</w:t>
-      </w:r>
-    </w:p>
-    <w:bookmarkStart w:id="12" w:name="X8a6d6d3492f4b9103b197346d6803413348c3fd"/>
-    <w:p>
-      <w:pPr>
-        <w:pStyle w:val="Heading3"/>
-      </w:pPr>
-      <w:r>
-        <w:t xml:space="preserve">FlowKI Club — Magazin &amp; KI-Community (Teamprojekt, Juli–Aug. 2026)</w:t>
-      </w:r>
-    </w:p>
-    <w:p>
-      <w:pPr>
-        <w:pStyle w:val="Compact"/>
-        <w:numPr>
-          <w:ilvl w:val="0"/>
-          <w:numId w:val="1004"/>
-        </w:numPr>
-      </w:pPr>
-      <w:r>
-        <w:t xml:space="preserve">Newsletter mit Double-Opt-In und Plausible-Events für Anmeldung, Bestätigung und CTAs implementiert.</w:t>
-      </w:r>
-    </w:p>
-    <w:p>
-      <w:pPr>
-        <w:pStyle w:val="Compact"/>
-        <w:numPr>
-          <w:ilvl w:val="0"/>
-          <w:numId w:val="1004"/>
-        </w:numPr>
-      </w:pPr>
-      <w:r>
-        <w:t xml:space="preserve">Social-Distribution: Social-Post-Pakete aus Artikeln erzeugt; Übergabe an das Veröffentlichungssystem mit Qualitätsprüfung und Markenregeln; UTM-Konvention und Link-in-Bio-Seite.</w:t>
-      </w:r>
-    </w:p>
-    <w:p>
-      <w:pPr>
-        <w:pStyle w:val="Compact"/>
-        <w:numPr>
-          <w:ilvl w:val="0"/>
-          <w:numId w:val="1004"/>
-        </w:numPr>
-      </w:pPr>
-      <w:r>
-        <w:t xml:space="preserve">Autorenprofile sowie optionale FAQ- und HowTo-Daten in die Artikelausgabe integriert; Referral-Programm.</w:t>
-      </w:r>
-    </w:p>
-    <w:bookmarkEnd w:id="12"/>
-    <w:bookmarkStart w:id="13" w:name="X7e61b755654290aac4206c7a385d687a0f95778"/>
-    <w:p>
-      <w:pPr>
-        <w:pStyle w:val="Heading3"/>
-      </w:pPr>
-      <w:r>
-        <w:t xml:space="preserve">Flowki Studio — Clip-Studio (Teamprojekt, 50 eigene PRs in Flowki Studio gemergt)</w:t>
-      </w:r>
-    </w:p>
-    <w:p>
-      <w:pPr>
-        <w:pStyle w:val="Compact"/>
-        <w:numPr>
-          <w:ilvl w:val="0"/>
-          <w:numId w:val="1005"/>
-        </w:numPr>
-      </w:pPr>
-      <w:r>
-        <w:t xml:space="preserve">Aus Langvideos werden Shorts: Ausschnitt folgt der sprechenden Person; bis zu drei Schnittvarianten je Clip.</w:t>
-      </w:r>
-    </w:p>
-    <w:p>
-      <w:pPr>
-        <w:pStyle w:val="Compact"/>
-        <w:numPr>
-          <w:ilvl w:val="0"/>
-          <w:numId w:val="1005"/>
-        </w:numPr>
-      </w:pPr>
-      <w:r>
-        <w:t xml:space="preserve">Freigaben: offene Clip-Prüfungen und Blind-Reviews im Dashboard angeschlossen, Freigabeoberflächen verbessert und Publikationsrechte unmittelbar vor dem Versand erneut geprüft.</w:t>
-      </w:r>
-    </w:p>
-    <w:bookmarkEnd w:id="13"/>
-    <w:bookmarkEnd w:id="14"/>
-    <w:bookmarkStart w:id="15" w:name="webdesign-kreativ-ki-werkzeuge"/>
+        <w:t xml:space="preserve">Weitere Web- &amp; Shop-Projekte</w:t>
+      </w:r>
+    </w:p>
+    <w:p>
+      <w:pPr>
+        <w:pStyle w:val="Compact"/>
+        <w:numPr>
+          <w:ilvl w:val="0"/>
+          <w:numId w:val="1006"/>
+        </w:numPr>
+      </w:pPr>
+      <w:r>
+        <w:t xml:space="preserve">AtopicV — Shopify-Theme auf Horizon-Basis gestaltet: Produktgeschichte in Kapiteln, mobile Kaufleiste, besserer Tastaturfokus. Unveröffentlichter Entwurf.</w:t>
+      </w:r>
+    </w:p>
+    <w:p>
+      <w:pPr>
+        <w:pStyle w:val="Compact"/>
+        <w:numPr>
+          <w:ilvl w:val="0"/>
+          <w:numId w:val="1006"/>
+        </w:numPr>
+      </w:pPr>
+      <w:r>
+        <w:t xml:space="preserve">nk247store.de — Kundenprojekt im Team: interaktive Überarbeitung mit Next.js und GSAP; Tabakwerbung nach § 19 TabakerzG aus allen Motiven entfernt. Meine Überarbeitung ist noch nicht veröffentlicht.</w:t>
+      </w:r>
+    </w:p>
+    <w:p>
+      <w:pPr>
+        <w:pStyle w:val="Compact"/>
+        <w:numPr>
+          <w:ilvl w:val="0"/>
+          <w:numId w:val="1006"/>
+        </w:numPr>
+      </w:pPr>
+      <w:r>
+        <w:t xml:space="preserve">Kreativ-KI — Redesign-Entwurf für ein Hamburger Izakaya mit KI-Website-Builder, selbst nachgearbeitet; Vergleichsworkflow für vier KI-Videomodelle mit gemeinsamem Ausgangsprompt.</w:t>
+      </w:r>
+    </w:p>
+    <w:p>
+      <w:pPr>
+        <w:pStyle w:val="Compact"/>
+        <w:numPr>
+          <w:ilvl w:val="0"/>
+          <w:numId w:val="1006"/>
+        </w:numPr>
+      </w:pPr>
+      <w:r>
+        <w:t xml:space="preserve">SEO-Dashboard (Prototyp) — Python-Werkzeug, das Search-Console-, GA4- und Bing-Daten zusammenführt und regelbasierte Hinweise erzeugt.</w:t>
+      </w:r>
+    </w:p>
+    <w:bookmarkEnd w:id="17"/>
+    <w:bookmarkStart w:id="18" w:name="kenntnisse-tools"/>
     <w:p>
       <w:pPr>
         <w:pStyle w:val="Heading2"/>
       </w:pPr>
       <w:r>
-        <w:t xml:space="preserve">Webdesign, Kreativ-KI &amp; Werkzeuge</w:t>
-      </w:r>
-    </w:p>
-    <w:p>
-      <w:pPr>
-        <w:pStyle w:val="Compact"/>
-        <w:numPr>
-          <w:ilvl w:val="0"/>
-          <w:numId w:val="1006"/>
-        </w:numPr>
-      </w:pPr>
-      <w:r>
-        <w:t xml:space="preserve">AtopicV — Shopify-Theme auf Horizon-Basis gestaltet: Produktgeschichte in Kapiteln, bearbeitete Produktmotive, mobile Kaufleiste, besserer Tastaturfokus und Touch-Ziele. Unveröffentlichter Entwurf.</w:t>
-      </w:r>
-    </w:p>
-    <w:p>
-      <w:pPr>
-        <w:pStyle w:val="Compact"/>
-        <w:numPr>
-          <w:ilvl w:val="0"/>
-          <w:numId w:val="1006"/>
-        </w:numPr>
-      </w:pPr>
-      <w:r>
-        <w:t xml:space="preserve">nk247store.de — Kundenprojekt im Team: interaktive Überarbeitung mit Next.js und GSAP; Tabakwerbung nach § 19 TabakerzG aus allen Motiven entfernt. Meine Überarbeitung ist noch nicht veröffentlicht.</w:t>
-      </w:r>
-    </w:p>
-    <w:p>
-      <w:pPr>
-        <w:pStyle w:val="Compact"/>
-        <w:numPr>
-          <w:ilvl w:val="0"/>
-          <w:numId w:val="1006"/>
-        </w:numPr>
-      </w:pPr>
-      <w:r>
-        <w:t xml:space="preserve">Kreativ-KI — Redesign-Entwurf für ein Hamburger Izakaya mit KI-Website-Builder, selbst nachgearbeitet; Vergleichsworkflow für vier KI-Videomodelle mit gemeinsamem Ausgangsprompt.</w:t>
-      </w:r>
-    </w:p>
-    <w:p>
-      <w:pPr>
-        <w:pStyle w:val="Compact"/>
-        <w:numPr>
-          <w:ilvl w:val="0"/>
-          <w:numId w:val="1006"/>
-        </w:numPr>
-      </w:pPr>
-      <w:r>
-        <w:t xml:space="preserve">SEO-Dashboard (Prototyp) — Python-Werkzeug, das Search-Console-, GA4- und Bing-Daten zusammenführt und regelbasierte Hinweise erzeugt.</w:t>
-      </w:r>
-    </w:p>
-    <w:bookmarkEnd w:id="15"/>
-    <w:bookmarkStart w:id="18" w:name="berufserfahrung"/>
+        <w:t xml:space="preserve">Kenntnisse &amp; Tools</w:t>
+      </w:r>
+    </w:p>
+    <w:p>
+      <w:pPr>
+        <w:pStyle w:val="Compact"/>
+        <w:numPr>
+          <w:ilvl w:val="0"/>
+          <w:numId w:val="1007"/>
+        </w:numPr>
+      </w:pPr>
+      <w:r>
+        <w:t xml:space="preserve">SEO: Technisches SEO, OnPage-SEO, Indexierung, strukturierte Daten (JSON-LD), interne Verlinkung, Canonicals, 301-Weiterleitungen, internationales SEO (hreflang-Prüfung), Core Web Vitals, GEO/AEO</w:t>
+      </w:r>
+    </w:p>
+    <w:p>
+      <w:pPr>
+        <w:pStyle w:val="Compact"/>
+        <w:numPr>
+          <w:ilvl w:val="0"/>
+          <w:numId w:val="1007"/>
+        </w:numPr>
+      </w:pPr>
+      <w:r>
+        <w:t xml:space="preserve">Analyse: Google Search Console, Google Analytics 4, Bing Webmaster Tools (API), Lighthouse, Plausible, IndexNow, UTM-Tracking</w:t>
+      </w:r>
+    </w:p>
+    <w:p>
+      <w:pPr>
+        <w:pStyle w:val="Compact"/>
+        <w:numPr>
+          <w:ilvl w:val="0"/>
+          <w:numId w:val="1007"/>
+        </w:numPr>
+      </w:pPr>
+      <w:r>
+        <w:t xml:space="preserve">E-Commerce: Shopify (Theme-Anpassung, Liquid, Metafelder, Admin-API), Google Merchant Center, Produktfeeds, Pinterest- und Microsoft-Kanal, Judge.me</w:t>
+      </w:r>
+    </w:p>
+    <w:p>
+      <w:pPr>
+        <w:pStyle w:val="Compact"/>
+        <w:numPr>
+          <w:ilvl w:val="0"/>
+          <w:numId w:val="1007"/>
+        </w:numPr>
+      </w:pPr>
+      <w:r>
+        <w:t xml:space="preserve">E-Mail &amp; CRM: Klaviyo (Flows, Vorlagen, consent-gesteuertes Onsite-Tracking), Double-Opt-In-Newsletter</w:t>
+      </w:r>
+    </w:p>
+    <w:p>
+      <w:pPr>
+        <w:pStyle w:val="Compact"/>
+        <w:numPr>
+          <w:ilvl w:val="0"/>
+          <w:numId w:val="1007"/>
+        </w:numPr>
+      </w:pPr>
+      <w:r>
+        <w:t xml:space="preserve">Web &amp; Automation: HTML, CSS, JavaScript, responsives Webdesign, Next.js, Python, n8n, GitHub Actions</w:t>
+      </w:r>
+    </w:p>
+    <w:p>
+      <w:pPr>
+        <w:pStyle w:val="Compact"/>
+        <w:numPr>
+          <w:ilvl w:val="0"/>
+          <w:numId w:val="1007"/>
+        </w:numPr>
+      </w:pPr>
+      <w:r>
+        <w:t xml:space="preserve">KI &amp; Community: Claude und Gemini (LLM-APIs), KI-Agenten (Claude Code), KI-Video (Veo, Kling), Discord-Community und Discord-Bots</w:t>
+      </w:r>
+    </w:p>
+    <w:bookmarkEnd w:id="18"/>
+    <w:bookmarkStart w:id="20" w:name="zertifikat-weiterbildung-sprachen"/>
     <w:p>
       <w:pPr>
         <w:pStyle w:val="Heading2"/>
       </w:pPr>
       <w:r>
-        <w:t xml:space="preserve">Berufserfahrung</w:t>
-      </w:r>
-    </w:p>
-    <w:bookmarkStart w:id="16" w:name="e-commerce-webentwicklung-ki-automation"/>
-    <w:p>
-      <w:pPr>
-        <w:pStyle w:val="Heading3"/>
-      </w:pPr>
-      <w:r>
-        <w:t xml:space="preserve">E-Commerce, Webentwicklung &amp; KI-Automation</w:t>
-      </w:r>
-    </w:p>
-    <w:p>
-      <w:pPr>
-        <w:pStyle w:val="FirstParagraph"/>
-      </w:pPr>
-      <w:r>
-        <w:rPr>
-          <w:b/>
-          <w:bCs/>
-        </w:rPr>
-        <w:t xml:space="preserve">2024 – heute | Eigene Projekte, Team- und Kundenprojekte | Hamburg / remote</w:t>
-      </w:r>
-    </w:p>
-    <w:p>
-      <w:pPr>
-        <w:pStyle w:val="Compact"/>
-        <w:numPr>
-          <w:ilvl w:val="0"/>
-          <w:numId w:val="1007"/>
-        </w:numPr>
-      </w:pPr>
-      <w:r>
-        <w:t xml:space="preserve">Shopify-Shop technisch und im Marketing betreut: Theme, SEO, Sprachen, Produktdaten, E-Mail, Messung.</w:t>
-      </w:r>
-    </w:p>
-    <w:p>
-      <w:pPr>
-        <w:pStyle w:val="Compact"/>
-        <w:numPr>
-          <w:ilvl w:val="0"/>
-          <w:numId w:val="1007"/>
-        </w:numPr>
-      </w:pPr>
-      <w:r>
-        <w:t xml:space="preserve">Python-Backends und Next.js-Frontends entwickelt und auf Linux-Servern betrieben; im Team über Branches, Pull Requests und gemeinsame Test-Suites.</w:t>
-      </w:r>
-    </w:p>
-    <w:bookmarkEnd w:id="16"/>
-    <w:bookmarkStart w:id="17" w:name="b2b-direktvertrieb-door-to-door"/>
-    <w:p>
-      <w:pPr>
-        <w:pStyle w:val="Heading3"/>
-      </w:pPr>
-      <w:r>
-        <w:t xml:space="preserve">B2B-Direktvertrieb (Door-to-Door)</w:t>
-      </w:r>
-    </w:p>
-    <w:p>
-      <w:pPr>
-        <w:pStyle w:val="FirstParagraph"/>
-      </w:pPr>
-      <w:r>
-        <w:rPr>
-          <w:b/>
-          <w:bCs/>
-        </w:rPr>
-        <w:t xml:space="preserve">2019 – 2023 | EWE TEL, Ranger Marketing | Außendienst bundesweit</w:t>
+        <w:t xml:space="preserve">Zertifikat, Weiterbildung &amp; Sprachen</w:t>
       </w:r>
     </w:p>
     <w:p>
@@ -566,42 +577,7 @@
         </w:numPr>
       </w:pPr>
       <w:r>
-        <w:t xml:space="preserve">Kaltakquise und Bedarfsgespräche mit Inhabern und Geschäftsführern, Verhandlung und Abschluss vor Ort.</w:t>
-      </w:r>
-    </w:p>
-    <w:p>
-      <w:pPr>
-        <w:pStyle w:val="Compact"/>
-        <w:numPr>
-          <w:ilvl w:val="0"/>
-          <w:numId w:val="1008"/>
-        </w:numPr>
-      </w:pPr>
-      <w:r>
-        <w:t xml:space="preserve">Täglicher Umgang mit Absagen — und der Blick dafür, welche Probleme ein Betrieb wirklich hat.</w:t>
-      </w:r>
-    </w:p>
-    <w:bookmarkEnd w:id="17"/>
-    <w:bookmarkEnd w:id="18"/>
-    <w:bookmarkStart w:id="20" w:name="zertifikat-weiterbildung"/>
-    <w:p>
-      <w:pPr>
-        <w:pStyle w:val="Heading2"/>
-      </w:pPr>
-      <w:r>
-        <w:t xml:space="preserve">Zertifikat &amp; Weiterbildung</w:t>
-      </w:r>
-    </w:p>
-    <w:p>
-      <w:pPr>
-        <w:pStyle w:val="Compact"/>
-        <w:numPr>
-          <w:ilvl w:val="0"/>
-          <w:numId w:val="1009"/>
-        </w:numPr>
-      </w:pPr>
-      <w:r>
-        <w:t xml:space="preserve">Google Ads Search Certification (Skillshop), Dezember 2025, gültig bis 03.12.2026 – verifizierbar:</w:t>
+        <w:t xml:space="preserve">Zertifikat: Google Ads Search Certification (Skillshop), Dezember 2025, gültig bis 03.12.2026 – verifizierbar:</w:t>
       </w:r>
       <w:r>
         <w:t xml:space="preserve"> </w:t>
@@ -620,119 +596,39 @@
         <w:pStyle w:val="Compact"/>
         <w:numPr>
           <w:ilvl w:val="0"/>
-          <w:numId w:val="1009"/>
-        </w:numPr>
-      </w:pPr>
-      <w:r>
-        <w:t xml:space="preserve">Weiterbildung Webentwicklung, 2024 (6 Monate): HTML, CSS, JavaScript, Web-Architektur</w:t>
+          <w:numId w:val="1008"/>
+        </w:numPr>
+      </w:pPr>
+      <w:r>
+        <w:t xml:space="preserve">Weiterbildung: Webentwicklung, 2024 (6 Monate): HTML, CSS, JavaScript, Web-Architektur</w:t>
+      </w:r>
+    </w:p>
+    <w:p>
+      <w:pPr>
+        <w:pStyle w:val="Compact"/>
+        <w:numPr>
+          <w:ilvl w:val="0"/>
+          <w:numId w:val="1008"/>
+        </w:numPr>
+      </w:pPr>
+      <w:r>
+        <w:t xml:space="preserve">Sprachen: Deutsch (Muttersprache) · Englisch (B1, Richtung B2) · Polnisch (mündlich)</w:t>
+      </w:r>
+    </w:p>
+    <w:p>
+      <w:pPr>
+        <w:pStyle w:val="Compact"/>
+        <w:numPr>
+          <w:ilvl w:val="0"/>
+          <w:numId w:val="1008"/>
+        </w:numPr>
+      </w:pPr>
+      <w:r>
+        <w:t xml:space="preserve">Remote-Arbeit: Verteilte Teamarbeit über GitHub (Branches, Pull Requests), Discord und Online-Calls</w:t>
       </w:r>
     </w:p>
     <w:bookmarkEnd w:id="20"/>
-    <w:bookmarkStart w:id="21" w:name="kenntnisse-tools-in-projekten-eingesetzt"/>
-    <w:p>
-      <w:pPr>
-        <w:pStyle w:val="Heading2"/>
-      </w:pPr>
-      <w:r>
-        <w:t xml:space="preserve">Kenntnisse &amp; Tools (in Projekten eingesetzt)</w:t>
-      </w:r>
-    </w:p>
-    <w:p>
-      <w:pPr>
-        <w:pStyle w:val="Compact"/>
-        <w:numPr>
-          <w:ilvl w:val="0"/>
-          <w:numId w:val="1010"/>
-        </w:numPr>
-      </w:pPr>
-      <w:r>
-        <w:t xml:space="preserve">SEO: Technisches SEO, OnPage-SEO, Indexierung, strukturierte Daten (JSON-LD), interne Verlinkung, Canonicals, 301-Weiterleitungen, internationales SEO (hreflang-Prüfung), Core Web Vitals, GEO/AEO</w:t>
-      </w:r>
-    </w:p>
-    <w:p>
-      <w:pPr>
-        <w:pStyle w:val="Compact"/>
-        <w:numPr>
-          <w:ilvl w:val="0"/>
-          <w:numId w:val="1010"/>
-        </w:numPr>
-      </w:pPr>
-      <w:r>
-        <w:t xml:space="preserve">Analyse &amp; Tools: Google Search Console, Google Analytics 4, Bing Webmaster Tools (API), Lighthouse, Plausible, IndexNow, UTM-Tracking</w:t>
-      </w:r>
-    </w:p>
-    <w:p>
-      <w:pPr>
-        <w:pStyle w:val="Compact"/>
-        <w:numPr>
-          <w:ilvl w:val="0"/>
-          <w:numId w:val="1010"/>
-        </w:numPr>
-      </w:pPr>
-      <w:r>
-        <w:t xml:space="preserve">E-Commerce: Shopify (Theme-Anpassung, Liquid, Metafelder, Admin-API), Google Merchant Center, Produktfeeds, Pinterest- und Microsoft-Kanal, Judge.me</w:t>
-      </w:r>
-    </w:p>
-    <w:p>
-      <w:pPr>
-        <w:pStyle w:val="Compact"/>
-        <w:numPr>
-          <w:ilvl w:val="0"/>
-          <w:numId w:val="1010"/>
-        </w:numPr>
-      </w:pPr>
-      <w:r>
-        <w:t xml:space="preserve">E-Mail-Marketing &amp; Automation: Klaviyo (Flows, Vorlagen, consent-gesteuertes Onsite-Tracking), Double-Opt-In-Newsletter</w:t>
-      </w:r>
-    </w:p>
-    <w:p>
-      <w:pPr>
-        <w:pStyle w:val="Compact"/>
-        <w:numPr>
-          <w:ilvl w:val="0"/>
-          <w:numId w:val="1010"/>
-        </w:numPr>
-      </w:pPr>
-      <w:r>
-        <w:t xml:space="preserve">Web &amp; Automation: HTML, CSS, JavaScript, responsives Webdesign, Next.js, Python, n8n, GitHub Actions</w:t>
-      </w:r>
-    </w:p>
-    <w:p>
-      <w:pPr>
-        <w:pStyle w:val="Compact"/>
-        <w:numPr>
-          <w:ilvl w:val="0"/>
-          <w:numId w:val="1010"/>
-        </w:numPr>
-      </w:pPr>
-      <w:r>
-        <w:t xml:space="preserve">KI: Claude und Gemini (LLM-APIs), KI-Agenten (Claude Code), KI-Video (Veo, Kling)</w:t>
-      </w:r>
-    </w:p>
     <w:bookmarkEnd w:id="21"/>
-    <w:bookmarkStart w:id="22" w:name="sprachen"/>
-    <w:p>
-      <w:pPr>
-        <w:pStyle w:val="Heading2"/>
-      </w:pPr>
-      <w:r>
-        <w:t xml:space="preserve">Sprachen</w:t>
-      </w:r>
-    </w:p>
-    <w:p>
-      <w:pPr>
-        <w:pStyle w:val="Compact"/>
-        <w:numPr>
-          <w:ilvl w:val="0"/>
-          <w:numId w:val="1011"/>
-        </w:numPr>
-      </w:pPr>
-      <w:r>
-        <w:t xml:space="preserve">Deutsch: Muttersprache · Englisch: B1, Richtung B2 · Polnisch: mündlich</w:t>
-      </w:r>
-    </w:p>
-    <w:bookmarkEnd w:id="22"/>
-    <w:bookmarkEnd w:id="23"/>
     <w:sectPr>
       <w:footnotePr>
         <w:numRestart w:val="eachSect"/>
@@ -971,15 +867,6 @@
     <w:abstractNumId w:val="991"/>
   </w:num>
   <w:num w:numId="1008">
-    <w:abstractNumId w:val="991"/>
-  </w:num>
-  <w:num w:numId="1009">
-    <w:abstractNumId w:val="991"/>
-  </w:num>
-  <w:num w:numId="1010">
-    <w:abstractNumId w:val="991"/>
-  </w:num>
-  <w:num w:numId="1011">
     <w:abstractNumId w:val="991"/>
   </w:num>
 </w:numbering>

</xml_diff>